<commit_message>
Added that classes should be kept
</commit_message>
<xml_diff>
--- a/01 Intro + Opsamling + Interfaces/Interfaces - ECG.DOCX
+++ b/01 Intro + Opsamling + Interfaces/Interfaces - ECG.DOCX
@@ -1,6 +1,6 @@
 
 <file path=word/document.xml><?xml version="1.0" encoding="utf-8"?>
-<w:document xmlns:wpc="http://schemas.microsoft.com/office/word/2010/wordprocessingCanvas" xmlns:cx="http://schemas.microsoft.com/office/drawing/2014/chartex" xmlns:cx1="http://schemas.microsoft.com/office/drawing/2015/9/8/chartex" xmlns:cx2="http://schemas.microsoft.com/office/drawing/2015/10/21/chartex" xmlns:cx3="http://schemas.microsoft.com/office/drawing/2016/5/9/chartex" xmlns:cx4="http://schemas.microsoft.com/office/drawing/2016/5/10/chartex" xmlns:cx5="http://schemas.microsoft.com/office/drawing/2016/5/11/chartex" xmlns:cx6="http://schemas.microsoft.com/office/drawing/2016/5/12/chartex" xmlns:cx7="http://schemas.microsoft.com/office/drawing/2016/5/13/chartex" xmlns:cx8="http://schemas.microsoft.com/office/drawing/2016/5/14/chartex" xmlns:mc="http://schemas.openxmlformats.org/markup-compatibility/2006" xmlns:aink="http://schemas.microsoft.com/office/drawing/2016/ink" xmlns:am3d="http://schemas.microsoft.com/office/drawing/2017/model3d" xmlns:o="urn:schemas-microsoft-com:office:office" xmlns:oel="http://schemas.microsoft.com/office/2019/extlst" xmlns:r="http://schemas.openxmlformats.org/officeDocument/2006/relationships" xmlns:m="http://schemas.openxmlformats.org/officeDocument/2006/math" xmlns:v="urn:schemas-microsoft-com:vml" xmlns:wp14="http://schemas.microsoft.com/office/word/2010/wordprocessingDrawing" xmlns:wp="http://schemas.openxmlformats.org/drawingml/2006/wordprocessingDrawing" xmlns:w10="urn:schemas-microsoft-com:office:word" xmlns:w="http://schemas.openxmlformats.org/wordprocessingml/2006/main" xmlns:w14="http://schemas.microsoft.com/office/word/2010/wordml" xmlns:w15="http://schemas.microsoft.com/office/word/2012/wordml" xmlns:w16cex="http://schemas.microsoft.com/office/word/2018/wordml/cex" xmlns:w16cid="http://schemas.microsoft.com/office/word/2016/wordml/cid" xmlns:w16="http://schemas.microsoft.com/office/word/2018/wordml" xmlns:w16sdtdh="http://schemas.microsoft.com/office/word/2020/wordml/sdtdatahash" xmlns:w16se="http://schemas.microsoft.com/office/word/2015/wordml/symex" xmlns:wpg="http://schemas.microsoft.com/office/word/2010/wordprocessingGroup" xmlns:wpi="http://schemas.microsoft.com/office/word/2010/wordprocessingInk" xmlns:wne="http://schemas.microsoft.com/office/word/2006/wordml" xmlns:wps="http://schemas.microsoft.com/office/word/2010/wordprocessingShape" mc:Ignorable="w14 w15 w16se w16cid w16 w16cex w16sdtdh wp14">
+<w:document xmlns:wpc="http://schemas.microsoft.com/office/word/2010/wordprocessingCanvas" xmlns:cx="http://schemas.microsoft.com/office/drawing/2014/chartex" xmlns:cx1="http://schemas.microsoft.com/office/drawing/2015/9/8/chartex" xmlns:cx2="http://schemas.microsoft.com/office/drawing/2015/10/21/chartex" xmlns:cx3="http://schemas.microsoft.com/office/drawing/2016/5/9/chartex" xmlns:cx4="http://schemas.microsoft.com/office/drawing/2016/5/10/chartex" xmlns:cx5="http://schemas.microsoft.com/office/drawing/2016/5/11/chartex" xmlns:cx6="http://schemas.microsoft.com/office/drawing/2016/5/12/chartex" xmlns:cx7="http://schemas.microsoft.com/office/drawing/2016/5/13/chartex" xmlns:cx8="http://schemas.microsoft.com/office/drawing/2016/5/14/chartex" xmlns:mc="http://schemas.openxmlformats.org/markup-compatibility/2006" xmlns:m="http://schemas.openxmlformats.org/officeDocument/2006/math" xmlns:aink="http://schemas.microsoft.com/office/drawing/2016/ink" xmlns:am3d="http://schemas.microsoft.com/office/drawing/2017/model3d" xmlns:oel="http://schemas.microsoft.com/office/2019/extlst" xmlns:r="http://schemas.openxmlformats.org/officeDocument/2006/relationships" xmlns:wp14="http://schemas.microsoft.com/office/word/2010/wordprocessingDrawing" xmlns:wp="http://schemas.openxmlformats.org/drawingml/2006/wordprocessingDrawing" xmlns:wpg="http://schemas.microsoft.com/office/word/2010/wordprocessingGroup" xmlns:wpi="http://schemas.microsoft.com/office/word/2010/wordprocessingInk" xmlns:wps="http://schemas.microsoft.com/office/word/2010/wordprocessingShape" xmlns:o="urn:schemas-microsoft-com:office:office" xmlns:v="urn:schemas-microsoft-com:vml" xmlns:w10="urn:schemas-microsoft-com:office:word" xmlns:w="http://schemas.openxmlformats.org/wordprocessingml/2006/main" xmlns:w14="http://schemas.microsoft.com/office/word/2010/wordml" xmlns:w15="http://schemas.microsoft.com/office/word/2012/wordml" xmlns:w16cex="http://schemas.microsoft.com/office/word/2018/wordml/cex" xmlns:w16cid="http://schemas.microsoft.com/office/word/2016/wordml/cid" xmlns:w16="http://schemas.microsoft.com/office/word/2018/wordml" xmlns:w16sdtdh="http://schemas.microsoft.com/office/word/2020/wordml/sdtdatahash" xmlns:w16sdtfl="http://schemas.microsoft.com/office/word/2024/wordml/sdtformatlock" xmlns:w16se="http://schemas.microsoft.com/office/word/2015/wordml/symex" xmlns:w16du="http://schemas.microsoft.com/office/word/2023/wordml/word16du" xmlns:wne="http://schemas.microsoft.com/office/word/2006/wordml" mc:Ignorable="w14 w15 w16se w16cid w16 w16cex w16sdtdh w16sdtfl w16du wp14">
   <w:body>
     <w:p>
       <w:pPr>
@@ -263,7 +263,7 @@
         <w:rPr>
           <w:noProof/>
         </w:rPr>
-        <w:object w:dxaOrig="6586" w:dyaOrig="2805">
+        <w:object w:dxaOrig="6586" w:dyaOrig="2805" w14:anchorId="7CC1296A">
           <v:shapetype id="_x0000_t75" coordsize="21600,21600" o:spt="75" o:preferrelative="t" path="m@4@5l@4@11@9@11@9@5xe" filled="f" stroked="f">
             <v:stroke joinstyle="miter"/>
             <v:formulas>
@@ -283,10 +283,10 @@
             <v:path o:extrusionok="f" gradientshapeok="t" o:connecttype="rect"/>
             <o:lock v:ext="edit" aspectratio="t"/>
           </v:shapetype>
-          <v:shape id="_x0000_i1027" type="#_x0000_t75" alt="" style="width:328.7pt;height:140.25pt;mso-width-percent:0;mso-height-percent:0;mso-width-percent:0;mso-height-percent:0" o:ole="">
+          <v:shape id="_x0000_i1027" type="#_x0000_t75" alt="" style="width:329pt;height:140.1pt;mso-width-percent:0;mso-height-percent:0;mso-width-percent:0;mso-height-percent:0" o:ole="">
             <v:imagedata r:id="rId8" o:title=""/>
           </v:shape>
-          <o:OLEObject Type="Embed" ProgID="Visio.Drawing.15" ShapeID="_x0000_i1027" DrawAspect="Content" ObjectID="_1754222441" r:id="rId9"/>
+          <o:OLEObject Type="Embed" ProgID="Visio.Drawing.15" ShapeID="_x0000_i1027" DrawAspect="Content" ObjectID="_1844920350" r:id="rId9"/>
         </w:object>
       </w:r>
     </w:p>
@@ -359,7 +359,6 @@
         </w:rPr>
         <w:t xml:space="preserve">The </w:t>
       </w:r>
-      <w:proofErr w:type="gramStart"/>
       <w:r>
         <w:rPr>
           <w:rStyle w:val="CodeChar"/>
@@ -372,27 +371,19 @@
           <w:rStyle w:val="CodeChar"/>
           <w:lang w:val="en-US"/>
         </w:rPr>
-        <w:t>(</w:t>
-      </w:r>
-      <w:proofErr w:type="gramEnd"/>
+        <w:t>()</w:t>
+      </w:r>
+      <w:r>
+        <w:rPr>
+          <w:lang w:val="en-US"/>
+        </w:rPr>
+        <w:t xml:space="preserve"> method of the </w:t>
+      </w:r>
       <w:r>
         <w:rPr>
           <w:rStyle w:val="CodeChar"/>
           <w:lang w:val="en-US"/>
         </w:rPr>
-        <w:t>)</w:t>
-      </w:r>
-      <w:r>
-        <w:rPr>
-          <w:lang w:val="en-US"/>
-        </w:rPr>
-        <w:t xml:space="preserve"> method of the </w:t>
-      </w:r>
-      <w:r>
-        <w:rPr>
-          <w:rStyle w:val="CodeChar"/>
-          <w:lang w:val="en-US"/>
-        </w:rPr>
         <w:t>Processing</w:t>
       </w:r>
       <w:r>
@@ -413,7 +404,6 @@
         </w:rPr>
         <w:t xml:space="preserve">The </w:t>
       </w:r>
-      <w:proofErr w:type="gramStart"/>
       <w:r>
         <w:rPr>
           <w:rFonts w:ascii="Consolas" w:hAnsi="Consolas"/>
@@ -421,9 +411,14 @@
           <w:szCs w:val="18"/>
           <w:lang w:val="en-US"/>
         </w:rPr>
-        <w:t>Count(</w:t>
-      </w:r>
-      <w:proofErr w:type="gramEnd"/>
+        <w:t>Count()</w:t>
+      </w:r>
+      <w:r>
+        <w:rPr>
+          <w:lang w:val="en-US"/>
+        </w:rPr>
+        <w:t xml:space="preserve"> method returns the size of the </w:t>
+      </w:r>
       <w:r>
         <w:rPr>
           <w:rFonts w:ascii="Consolas" w:hAnsi="Consolas"/>
@@ -431,21 +426,6 @@
           <w:szCs w:val="18"/>
           <w:lang w:val="en-US"/>
         </w:rPr>
-        <w:t>)</w:t>
-      </w:r>
-      <w:r>
-        <w:rPr>
-          <w:lang w:val="en-US"/>
-        </w:rPr>
-        <w:t xml:space="preserve"> method returns the size of the </w:t>
-      </w:r>
-      <w:r>
-        <w:rPr>
-          <w:rFonts w:ascii="Consolas" w:hAnsi="Consolas"/>
-          <w:sz w:val="18"/>
-          <w:szCs w:val="18"/>
-          <w:lang w:val="en-US"/>
-        </w:rPr>
         <w:t>_samples</w:t>
       </w:r>
       <w:r>
@@ -470,11 +450,11 @@
         <w:rPr>
           <w:noProof/>
         </w:rPr>
-        <w:object w:dxaOrig="6841" w:dyaOrig="1741">
-          <v:shape id="_x0000_i1026" type="#_x0000_t75" alt="" style="width:341.85pt;height:87.05pt;mso-width-percent:0;mso-height-percent:0;mso-width-percent:0;mso-height-percent:0" o:ole="">
+        <w:object w:dxaOrig="6841" w:dyaOrig="1741" w14:anchorId="6219A4D3">
+          <v:shape id="_x0000_i1026" type="#_x0000_t75" alt="" style="width:342.3pt;height:86.95pt;mso-width-percent:0;mso-height-percent:0;mso-width-percent:0;mso-height-percent:0" o:ole="">
             <v:imagedata r:id="rId10" o:title=""/>
           </v:shape>
-          <o:OLEObject Type="Embed" ProgID="Visio.Drawing.15" ShapeID="_x0000_i1026" DrawAspect="Content" ObjectID="_1754222442" r:id="rId11"/>
+          <o:OLEObject Type="Embed" ProgID="Visio.Drawing.15" ShapeID="_x0000_i1026" DrawAspect="Content" ObjectID="_1844920351" r:id="rId11"/>
         </w:object>
       </w:r>
     </w:p>
@@ -622,7 +602,19 @@
         <w:rPr>
           <w:lang w:val="en-US"/>
         </w:rPr>
-        <w:t xml:space="preserve"> class. Your class diagram should contain all methods for all classes and interfaces.</w:t>
+        <w:t xml:space="preserve"> class</w:t>
+      </w:r>
+      <w:r>
+        <w:rPr>
+          <w:lang w:val="en-US"/>
+        </w:rPr>
+        <w:t xml:space="preserve"> and keep the existing classes</w:t>
+      </w:r>
+      <w:r>
+        <w:rPr>
+          <w:lang w:val="en-US"/>
+        </w:rPr>
+        <w:t>. Your class diagram should contain all methods for all classes and interfaces.</w:t>
       </w:r>
     </w:p>
     <w:p>
@@ -690,14 +682,7 @@
         <w:rPr>
           <w:lang w:val="en-US"/>
         </w:rPr>
-        <w:t xml:space="preserve">method in the </w:t>
-      </w:r>
-      <w:proofErr w:type="spellStart"/>
-      <w:r>
-        <w:rPr>
-          <w:lang w:val="en-US"/>
-        </w:rPr>
-        <w:t>P</w:t>
+        <w:t>method in the P</w:t>
       </w:r>
       <w:r>
         <w:rPr>
@@ -709,14 +694,7 @@
         <w:rPr>
           <w:lang w:val="en-US"/>
         </w:rPr>
-        <w:t>.cs</w:t>
-      </w:r>
-      <w:proofErr w:type="spellEnd"/>
-      <w:r>
-        <w:rPr>
-          <w:lang w:val="en-US"/>
-        </w:rPr>
-        <w:t xml:space="preserve"> file, which</w:t>
+        <w:t>.cs file, which</w:t>
       </w:r>
       <w:r>
         <w:rPr>
@@ -736,67 +714,49 @@
         </w:rPr>
         <w:t xml:space="preserve">. Notice: Did you have to do any changes to the </w:t>
       </w:r>
-      <w:proofErr w:type="gramStart"/>
       <w:r>
         <w:rPr>
           <w:rStyle w:val="CodeChar"/>
           <w:lang w:val="en-US"/>
         </w:rPr>
-        <w:t>Main(</w:t>
-      </w:r>
-      <w:proofErr w:type="gramEnd"/>
+        <w:t>Main()</w:t>
+      </w:r>
+      <w:r>
+        <w:rPr>
+          <w:lang w:val="en-US"/>
+        </w:rPr>
+        <w:t xml:space="preserve"> </w:t>
+      </w:r>
+      <w:r>
+        <w:rPr>
+          <w:lang w:val="en-US"/>
+        </w:rPr>
+        <w:t>method</w:t>
+      </w:r>
+      <w:r>
+        <w:rPr>
+          <w:lang w:val="en-US"/>
+        </w:rPr>
+        <w:t xml:space="preserve"> to use your new design? No? That’s great! This means that we have implemented the design changes without affecting </w:t>
+      </w:r>
+      <w:r>
+        <w:rPr>
+          <w:lang w:val="en-US"/>
+        </w:rPr>
+        <w:t>other parts of your program</w:t>
+      </w:r>
+      <w:r>
+        <w:rPr>
+          <w:lang w:val="en-US"/>
+        </w:rPr>
+        <w:t xml:space="preserve">, namely </w:t>
+      </w:r>
       <w:r>
         <w:rPr>
           <w:rStyle w:val="CodeChar"/>
           <w:lang w:val="en-US"/>
         </w:rPr>
-        <w:t>)</w:t>
-      </w:r>
-      <w:r>
-        <w:rPr>
-          <w:lang w:val="en-US"/>
-        </w:rPr>
-        <w:t xml:space="preserve"> </w:t>
-      </w:r>
-      <w:r>
-        <w:rPr>
-          <w:lang w:val="en-US"/>
-        </w:rPr>
-        <w:t>method</w:t>
-      </w:r>
-      <w:r>
-        <w:rPr>
-          <w:lang w:val="en-US"/>
-        </w:rPr>
-        <w:t xml:space="preserve"> to use your new design? No? That’s great! This means that we have implemented the design changes without affecting </w:t>
-      </w:r>
-      <w:r>
-        <w:rPr>
-          <w:lang w:val="en-US"/>
-        </w:rPr>
-        <w:t>other parts of your program</w:t>
-      </w:r>
-      <w:r>
-        <w:rPr>
-          <w:lang w:val="en-US"/>
-        </w:rPr>
-        <w:t xml:space="preserve">, namely </w:t>
-      </w:r>
-      <w:proofErr w:type="gramStart"/>
-      <w:r>
-        <w:rPr>
-          <w:rStyle w:val="CodeChar"/>
-          <w:lang w:val="en-US"/>
-        </w:rPr>
-        <w:t>Main(</w:t>
-      </w:r>
-      <w:proofErr w:type="gramEnd"/>
-      <w:r>
-        <w:rPr>
-          <w:rStyle w:val="CodeChar"/>
-          <w:lang w:val="en-US"/>
-        </w:rPr>
-        <w:t>)</w:t>
+        <w:t>Main()</w:t>
       </w:r>
       <w:r>
         <w:rPr>
@@ -983,21 +943,7 @@
         <w:rPr>
           <w:lang w:val="en-US"/>
         </w:rPr>
-        <w:t xml:space="preserve">? Compare this to the old design - which design is more “flexible”, </w:t>
-      </w:r>
-      <w:proofErr w:type="gramStart"/>
-      <w:r>
-        <w:rPr>
-          <w:lang w:val="en-US"/>
-        </w:rPr>
-        <w:t>i.e.</w:t>
-      </w:r>
-      <w:proofErr w:type="gramEnd"/>
-      <w:r>
-        <w:rPr>
-          <w:lang w:val="en-US"/>
-        </w:rPr>
-        <w:t xml:space="preserve"> ready for </w:t>
+        <w:t xml:space="preserve">? Compare this to the old design - which design is more “flexible”, i.e. ready for </w:t>
       </w:r>
       <w:r>
         <w:rPr>
@@ -1035,7 +981,6 @@
         </w:rPr>
         <w:t xml:space="preserve">Add </w:t>
       </w:r>
-      <w:proofErr w:type="spellStart"/>
       <w:r>
         <w:rPr>
           <w:rStyle w:val="CodeChar"/>
@@ -1043,7 +988,6 @@
         </w:rPr>
         <w:t>ExtremesProcessing</w:t>
       </w:r>
-      <w:proofErr w:type="spellEnd"/>
       <w:r>
         <w:rPr>
           <w:lang w:val="en-US"/>
@@ -1068,49 +1012,31 @@
         </w:rPr>
         <w:t xml:space="preserve">your implementation and test it using the same </w:t>
       </w:r>
-      <w:proofErr w:type="gramStart"/>
       <w:r>
         <w:rPr>
           <w:rStyle w:val="CodeChar"/>
           <w:lang w:val="en-US"/>
         </w:rPr>
-        <w:t>Main(</w:t>
-      </w:r>
-      <w:proofErr w:type="gramEnd"/>
+        <w:t>Main()</w:t>
+      </w:r>
+      <w:r>
+        <w:rPr>
+          <w:lang w:val="en-US"/>
+        </w:rPr>
+        <w:t xml:space="preserve"> </w:t>
+      </w:r>
+      <w:r>
+        <w:rPr>
+          <w:lang w:val="en-US"/>
+        </w:rPr>
+        <w:t xml:space="preserve">program as before. Again note how the </w:t>
+      </w:r>
       <w:r>
         <w:rPr>
           <w:rStyle w:val="CodeChar"/>
           <w:lang w:val="en-US"/>
         </w:rPr>
-        <w:t>)</w:t>
-      </w:r>
-      <w:r>
-        <w:rPr>
-          <w:lang w:val="en-US"/>
-        </w:rPr>
-        <w:t xml:space="preserve"> </w:t>
-      </w:r>
-      <w:r>
-        <w:rPr>
-          <w:lang w:val="en-US"/>
-        </w:rPr>
-        <w:t xml:space="preserve">program as before. Again note how the </w:t>
-      </w:r>
-      <w:proofErr w:type="gramStart"/>
-      <w:r>
-        <w:rPr>
-          <w:rStyle w:val="CodeChar"/>
-          <w:lang w:val="en-US"/>
-        </w:rPr>
-        <w:t>Main(</w:t>
-      </w:r>
-      <w:proofErr w:type="gramEnd"/>
-      <w:r>
-        <w:rPr>
-          <w:rStyle w:val="CodeChar"/>
-          <w:lang w:val="en-US"/>
-        </w:rPr>
-        <w:t>)</w:t>
+        <w:t>Main()</w:t>
       </w:r>
       <w:r>
         <w:rPr>
@@ -1202,7 +1128,6 @@
         </w:rPr>
         <w:t xml:space="preserve"> can decide which reporting type to use when the program starts. Hint: This requires changes to </w:t>
       </w:r>
-      <w:proofErr w:type="spellStart"/>
       <w:r>
         <w:rPr>
           <w:rStyle w:val="CodeChar"/>
@@ -1214,126 +1139,108 @@
         <w:rPr>
           <w:lang w:val="en-US"/>
         </w:rPr>
-        <w:t>’s</w:t>
-      </w:r>
-      <w:proofErr w:type="spellEnd"/>
-      <w:r>
-        <w:rPr>
-          <w:lang w:val="en-US"/>
-        </w:rPr>
-        <w:t xml:space="preserve"> constructor and therefore to the setup you do in the beginning of </w:t>
-      </w:r>
-      <w:proofErr w:type="gramStart"/>
+        <w:t xml:space="preserve">’s constructor and therefore to the setup you do in the beginning of </w:t>
+      </w:r>
       <w:r>
         <w:rPr>
           <w:rStyle w:val="CodeChar"/>
           <w:lang w:val="en-US"/>
         </w:rPr>
-        <w:t>Main(</w:t>
-      </w:r>
-      <w:proofErr w:type="gramEnd"/>
+        <w:t>Main()</w:t>
+      </w:r>
+      <w:r>
+        <w:rPr>
+          <w:lang w:val="en-US"/>
+        </w:rPr>
+        <w:t>.</w:t>
+      </w:r>
+    </w:p>
+    <w:p>
+      <w:pPr>
+        <w:rPr>
+          <w:lang w:val="en-US"/>
+        </w:rPr>
+      </w:pPr>
+    </w:p>
+    <w:p>
+      <w:pPr>
+        <w:rPr>
+          <w:lang w:val="en-US"/>
+        </w:rPr>
+      </w:pPr>
+    </w:p>
+    <w:p>
+      <w:pPr>
+        <w:rPr>
+          <w:b/>
+          <w:lang w:val="en-US"/>
+        </w:rPr>
+      </w:pPr>
+      <w:r>
+        <w:rPr>
+          <w:b/>
+          <w:lang w:val="en-US"/>
+        </w:rPr>
+        <w:t>Exercise 6 (</w:t>
+      </w:r>
+      <w:r>
+        <w:rPr>
+          <w:b/>
+          <w:lang w:val="en-US"/>
+        </w:rPr>
+        <w:t>optional</w:t>
+      </w:r>
+      <w:r>
+        <w:rPr>
+          <w:b/>
+          <w:lang w:val="en-US"/>
+        </w:rPr>
+        <w:t>):</w:t>
+      </w:r>
+    </w:p>
+    <w:p>
+      <w:pPr>
+        <w:rPr>
+          <w:lang w:val="en-US"/>
+        </w:rPr>
+      </w:pPr>
+      <w:r>
+        <w:rPr>
+          <w:lang w:val="en-US"/>
+        </w:rPr>
+        <w:t xml:space="preserve">Add a new way to </w:t>
+      </w:r>
+      <w:r>
+        <w:rPr>
+          <w:lang w:val="en-US"/>
+        </w:rPr>
+        <w:t>process</w:t>
+      </w:r>
+      <w:r>
+        <w:rPr>
+          <w:lang w:val="en-US"/>
+        </w:rPr>
+        <w:t xml:space="preserve"> ECG samples</w:t>
+      </w:r>
+      <w:r>
+        <w:rPr>
+          <w:lang w:val="en-US"/>
+        </w:rPr>
+        <w:t xml:space="preserve"> to your design,</w:t>
+      </w:r>
+      <w:r>
+        <w:rPr>
+          <w:lang w:val="en-US"/>
+        </w:rPr>
+        <w:t xml:space="preserve"> </w:t>
+      </w:r>
       <w:r>
         <w:rPr>
           <w:rStyle w:val="CodeChar"/>
           <w:lang w:val="en-US"/>
         </w:rPr>
-        <w:t>)</w:t>
-      </w:r>
-      <w:r>
-        <w:rPr>
-          <w:lang w:val="en-US"/>
-        </w:rPr>
-        <w:t>.</w:t>
-      </w:r>
-    </w:p>
-    <w:p>
-      <w:pPr>
-        <w:rPr>
-          <w:lang w:val="en-US"/>
-        </w:rPr>
-      </w:pPr>
-    </w:p>
-    <w:p>
-      <w:pPr>
-        <w:rPr>
-          <w:lang w:val="en-US"/>
-        </w:rPr>
-      </w:pPr>
-    </w:p>
-    <w:p>
-      <w:pPr>
-        <w:rPr>
-          <w:b/>
-          <w:lang w:val="en-US"/>
-        </w:rPr>
-      </w:pPr>
-      <w:r>
-        <w:rPr>
-          <w:b/>
-          <w:lang w:val="en-US"/>
-        </w:rPr>
-        <w:t>Exercise 6 (</w:t>
-      </w:r>
-      <w:r>
-        <w:rPr>
-          <w:b/>
-          <w:lang w:val="en-US"/>
-        </w:rPr>
-        <w:t>optional</w:t>
-      </w:r>
-      <w:r>
-        <w:rPr>
-          <w:b/>
-          <w:lang w:val="en-US"/>
-        </w:rPr>
-        <w:t>):</w:t>
-      </w:r>
-    </w:p>
-    <w:p>
-      <w:pPr>
-        <w:rPr>
-          <w:lang w:val="en-US"/>
-        </w:rPr>
-      </w:pPr>
-      <w:r>
-        <w:rPr>
-          <w:lang w:val="en-US"/>
-        </w:rPr>
-        <w:t xml:space="preserve">Add a new way to </w:t>
-      </w:r>
-      <w:r>
-        <w:rPr>
-          <w:lang w:val="en-US"/>
-        </w:rPr>
-        <w:t>process</w:t>
-      </w:r>
-      <w:r>
-        <w:rPr>
-          <w:lang w:val="en-US"/>
-        </w:rPr>
-        <w:t xml:space="preserve"> ECG samples</w:t>
-      </w:r>
-      <w:r>
-        <w:rPr>
-          <w:lang w:val="en-US"/>
-        </w:rPr>
-        <w:t xml:space="preserve"> to your design,</w:t>
-      </w:r>
-      <w:r>
-        <w:rPr>
-          <w:lang w:val="en-US"/>
-        </w:rPr>
-        <w:t xml:space="preserve"> </w:t>
-      </w:r>
-      <w:proofErr w:type="spellStart"/>
-      <w:r>
-        <w:rPr>
-          <w:rStyle w:val="CodeChar"/>
-          <w:lang w:val="en-US"/>
-        </w:rPr>
         <w:t>BPMProcessing</w:t>
       </w:r>
-      <w:proofErr w:type="spellEnd"/>
       <w:r>
         <w:rPr>
           <w:lang w:val="en-US"/>
@@ -1383,19 +1290,11 @@
         </w:rPr>
         <w:t xml:space="preserve">number of </w:t>
       </w:r>
-      <w:proofErr w:type="spellStart"/>
-      <w:r>
-        <w:rPr>
-          <w:lang w:val="en-US"/>
-        </w:rPr>
-        <w:t>heartbeats</w:t>
-      </w:r>
-      <w:proofErr w:type="spellEnd"/>
-      <w:r>
-        <w:rPr>
-          <w:lang w:val="en-US"/>
-        </w:rPr>
-        <w:t xml:space="preserve"> per minute (BPM). </w:t>
+      <w:r>
+        <w:rPr>
+          <w:lang w:val="en-US"/>
+        </w:rPr>
+        <w:t xml:space="preserve">heartbeats per minute (BPM). </w:t>
       </w:r>
       <w:r>
         <w:rPr>
@@ -1532,7 +1431,6 @@
         </w:rPr>
         <w:t xml:space="preserve">After you have added </w:t>
       </w:r>
-      <w:proofErr w:type="spellStart"/>
       <w:r>
         <w:rPr>
           <w:rStyle w:val="CodeChar"/>
@@ -1540,7 +1438,6 @@
         </w:rPr>
         <w:t>BPMProcessing</w:t>
       </w:r>
-      <w:proofErr w:type="spellEnd"/>
       <w:r>
         <w:rPr>
           <w:lang w:val="en-US"/>
@@ -1553,21 +1450,12 @@
         </w:rPr>
         <w:t xml:space="preserve">xtend your </w:t>
       </w:r>
-      <w:proofErr w:type="gramStart"/>
       <w:r>
         <w:rPr>
           <w:rStyle w:val="CodeChar"/>
           <w:lang w:val="en-US"/>
         </w:rPr>
-        <w:t>Main(</w:t>
-      </w:r>
-      <w:proofErr w:type="gramEnd"/>
-      <w:r>
-        <w:rPr>
-          <w:rStyle w:val="CodeChar"/>
-          <w:lang w:val="en-US"/>
-        </w:rPr>
-        <w:t>)</w:t>
+        <w:t>Main()</w:t>
       </w:r>
       <w:r>
         <w:rPr>
@@ -1620,11 +1508,11 @@
         <w:rPr>
           <w:noProof/>
         </w:rPr>
-        <w:object w:dxaOrig="6586" w:dyaOrig="2805">
-          <v:shape id="_x0000_i1025" type="#_x0000_t75" alt="" style="width:303.65pt;height:128.95pt;mso-width-percent:0;mso-height-percent:0;mso-width-percent:0;mso-height-percent:0" o:ole="">
+        <w:object w:dxaOrig="6586" w:dyaOrig="2805" w14:anchorId="78B0786C">
+          <v:shape id="_x0000_i1025" type="#_x0000_t75" alt="" style="width:304.05pt;height:129.05pt;mso-width-percent:0;mso-height-percent:0;mso-width-percent:0;mso-height-percent:0" o:ole="">
             <v:imagedata r:id="rId12" o:title=""/>
           </v:shape>
-          <o:OLEObject Type="Embed" ProgID="Visio.Drawing.15" ShapeID="_x0000_i1025" DrawAspect="Content" ObjectID="_1754222443" r:id="rId13"/>
+          <o:OLEObject Type="Embed" ProgID="Visio.Drawing.15" ShapeID="_x0000_i1025" DrawAspect="Content" ObjectID="_1844920352" r:id="rId13"/>
         </w:object>
       </w:r>
     </w:p>
@@ -1641,7 +1529,7 @@
 </file>
 
 <file path=word/endnotes.xml><?xml version="1.0" encoding="utf-8"?>
-<w:endnotes xmlns:wpc="http://schemas.microsoft.com/office/word/2010/wordprocessingCanvas" xmlns:cx="http://schemas.microsoft.com/office/drawing/2014/chartex" xmlns:cx1="http://schemas.microsoft.com/office/drawing/2015/9/8/chartex" xmlns:cx2="http://schemas.microsoft.com/office/drawing/2015/10/21/chartex" xmlns:cx3="http://schemas.microsoft.com/office/drawing/2016/5/9/chartex" xmlns:cx4="http://schemas.microsoft.com/office/drawing/2016/5/10/chartex" xmlns:cx5="http://schemas.microsoft.com/office/drawing/2016/5/11/chartex" xmlns:cx6="http://schemas.microsoft.com/office/drawing/2016/5/12/chartex" xmlns:cx7="http://schemas.microsoft.com/office/drawing/2016/5/13/chartex" xmlns:cx8="http://schemas.microsoft.com/office/drawing/2016/5/14/chartex" xmlns:mc="http://schemas.openxmlformats.org/markup-compatibility/2006" xmlns:aink="http://schemas.microsoft.com/office/drawing/2016/ink" xmlns:am3d="http://schemas.microsoft.com/office/drawing/2017/model3d" xmlns:o="urn:schemas-microsoft-com:office:office" xmlns:oel="http://schemas.microsoft.com/office/2019/extlst" xmlns:r="http://schemas.openxmlformats.org/officeDocument/2006/relationships" xmlns:m="http://schemas.openxmlformats.org/officeDocument/2006/math" xmlns:v="urn:schemas-microsoft-com:vml" xmlns:wp14="http://schemas.microsoft.com/office/word/2010/wordprocessingDrawing" xmlns:wp="http://schemas.openxmlformats.org/drawingml/2006/wordprocessingDrawing" xmlns:w10="urn:schemas-microsoft-com:office:word" xmlns:w="http://schemas.openxmlformats.org/wordprocessingml/2006/main" xmlns:w14="http://schemas.microsoft.com/office/word/2010/wordml" xmlns:w15="http://schemas.microsoft.com/office/word/2012/wordml" xmlns:w16cex="http://schemas.microsoft.com/office/word/2018/wordml/cex" xmlns:w16cid="http://schemas.microsoft.com/office/word/2016/wordml/cid" xmlns:w16="http://schemas.microsoft.com/office/word/2018/wordml" xmlns:w16sdtdh="http://schemas.microsoft.com/office/word/2020/wordml/sdtdatahash" xmlns:w16se="http://schemas.microsoft.com/office/word/2015/wordml/symex" xmlns:wpg="http://schemas.microsoft.com/office/word/2010/wordprocessingGroup" xmlns:wpi="http://schemas.microsoft.com/office/word/2010/wordprocessingInk" xmlns:wne="http://schemas.microsoft.com/office/word/2006/wordml" xmlns:wps="http://schemas.microsoft.com/office/word/2010/wordprocessingShape" mc:Ignorable="w14 w15 w16se w16cid w16 w16cex w16sdtdh wp14">
+<w:endnotes xmlns:wpc="http://schemas.microsoft.com/office/word/2010/wordprocessingCanvas" xmlns:cx="http://schemas.microsoft.com/office/drawing/2014/chartex" xmlns:cx1="http://schemas.microsoft.com/office/drawing/2015/9/8/chartex" xmlns:cx2="http://schemas.microsoft.com/office/drawing/2015/10/21/chartex" xmlns:cx3="http://schemas.microsoft.com/office/drawing/2016/5/9/chartex" xmlns:cx4="http://schemas.microsoft.com/office/drawing/2016/5/10/chartex" xmlns:cx5="http://schemas.microsoft.com/office/drawing/2016/5/11/chartex" xmlns:cx6="http://schemas.microsoft.com/office/drawing/2016/5/12/chartex" xmlns:cx7="http://schemas.microsoft.com/office/drawing/2016/5/13/chartex" xmlns:cx8="http://schemas.microsoft.com/office/drawing/2016/5/14/chartex" xmlns:mc="http://schemas.openxmlformats.org/markup-compatibility/2006" xmlns:m="http://schemas.openxmlformats.org/officeDocument/2006/math" xmlns:aink="http://schemas.microsoft.com/office/drawing/2016/ink" xmlns:am3d="http://schemas.microsoft.com/office/drawing/2017/model3d" xmlns:oel="http://schemas.microsoft.com/office/2019/extlst" xmlns:r="http://schemas.openxmlformats.org/officeDocument/2006/relationships" xmlns:wp14="http://schemas.microsoft.com/office/word/2010/wordprocessingDrawing" xmlns:wp="http://schemas.openxmlformats.org/drawingml/2006/wordprocessingDrawing" xmlns:wpg="http://schemas.microsoft.com/office/word/2010/wordprocessingGroup" xmlns:wpi="http://schemas.microsoft.com/office/word/2010/wordprocessingInk" xmlns:wps="http://schemas.microsoft.com/office/word/2010/wordprocessingShape" xmlns:o="urn:schemas-microsoft-com:office:office" xmlns:v="urn:schemas-microsoft-com:vml" xmlns:w10="urn:schemas-microsoft-com:office:word" xmlns:w="http://schemas.openxmlformats.org/wordprocessingml/2006/main" xmlns:w14="http://schemas.microsoft.com/office/word/2010/wordml" xmlns:w15="http://schemas.microsoft.com/office/word/2012/wordml" xmlns:w16cex="http://schemas.microsoft.com/office/word/2018/wordml/cex" xmlns:w16cid="http://schemas.microsoft.com/office/word/2016/wordml/cid" xmlns:w16="http://schemas.microsoft.com/office/word/2018/wordml" xmlns:w16sdtdh="http://schemas.microsoft.com/office/word/2020/wordml/sdtdatahash" xmlns:w16sdtfl="http://schemas.microsoft.com/office/word/2024/wordml/sdtformatlock" xmlns:w16se="http://schemas.microsoft.com/office/word/2015/wordml/symex" xmlns:w16du="http://schemas.microsoft.com/office/word/2023/wordml/word16du" xmlns:wne="http://schemas.microsoft.com/office/word/2006/wordml" mc:Ignorable="w14 w15 w16se w16cid w16 w16cex w16sdtdh w16sdtfl w16du wp14">
   <w:endnote w:type="separator" w:id="-1">
     <w:p>
       <w:r>
@@ -1660,7 +1548,7 @@
 </file>
 
 <file path=word/footer1.xml><?xml version="1.0" encoding="utf-8"?>
-<w:ftr xmlns:wpc="http://schemas.microsoft.com/office/word/2010/wordprocessingCanvas" xmlns:cx="http://schemas.microsoft.com/office/drawing/2014/chartex" xmlns:cx1="http://schemas.microsoft.com/office/drawing/2015/9/8/chartex" xmlns:cx2="http://schemas.microsoft.com/office/drawing/2015/10/21/chartex" xmlns:cx3="http://schemas.microsoft.com/office/drawing/2016/5/9/chartex" xmlns:cx4="http://schemas.microsoft.com/office/drawing/2016/5/10/chartex" xmlns:cx5="http://schemas.microsoft.com/office/drawing/2016/5/11/chartex" xmlns:cx6="http://schemas.microsoft.com/office/drawing/2016/5/12/chartex" xmlns:cx7="http://schemas.microsoft.com/office/drawing/2016/5/13/chartex" xmlns:cx8="http://schemas.microsoft.com/office/drawing/2016/5/14/chartex" xmlns:mc="http://schemas.openxmlformats.org/markup-compatibility/2006" xmlns:aink="http://schemas.microsoft.com/office/drawing/2016/ink" xmlns:am3d="http://schemas.microsoft.com/office/drawing/2017/model3d" xmlns:o="urn:schemas-microsoft-com:office:office" xmlns:oel="http://schemas.microsoft.com/office/2019/extlst" xmlns:r="http://schemas.openxmlformats.org/officeDocument/2006/relationships" xmlns:m="http://schemas.openxmlformats.org/officeDocument/2006/math" xmlns:v="urn:schemas-microsoft-com:vml" xmlns:wp14="http://schemas.microsoft.com/office/word/2010/wordprocessingDrawing" xmlns:wp="http://schemas.openxmlformats.org/drawingml/2006/wordprocessingDrawing" xmlns:w10="urn:schemas-microsoft-com:office:word" xmlns:w="http://schemas.openxmlformats.org/wordprocessingml/2006/main" xmlns:w14="http://schemas.microsoft.com/office/word/2010/wordml" xmlns:w15="http://schemas.microsoft.com/office/word/2012/wordml" xmlns:w16cex="http://schemas.microsoft.com/office/word/2018/wordml/cex" xmlns:w16cid="http://schemas.microsoft.com/office/word/2016/wordml/cid" xmlns:w16="http://schemas.microsoft.com/office/word/2018/wordml" xmlns:w16sdtdh="http://schemas.microsoft.com/office/word/2020/wordml/sdtdatahash" xmlns:w16se="http://schemas.microsoft.com/office/word/2015/wordml/symex" xmlns:wpg="http://schemas.microsoft.com/office/word/2010/wordprocessingGroup" xmlns:wpi="http://schemas.microsoft.com/office/word/2010/wordprocessingInk" xmlns:wne="http://schemas.microsoft.com/office/word/2006/wordml" xmlns:wps="http://schemas.microsoft.com/office/word/2010/wordprocessingShape" mc:Ignorable="w14 w15 w16se w16cid w16 w16cex w16sdtdh wp14">
+<w:ftr xmlns:wpc="http://schemas.microsoft.com/office/word/2010/wordprocessingCanvas" xmlns:cx="http://schemas.microsoft.com/office/drawing/2014/chartex" xmlns:cx1="http://schemas.microsoft.com/office/drawing/2015/9/8/chartex" xmlns:cx2="http://schemas.microsoft.com/office/drawing/2015/10/21/chartex" xmlns:cx3="http://schemas.microsoft.com/office/drawing/2016/5/9/chartex" xmlns:cx4="http://schemas.microsoft.com/office/drawing/2016/5/10/chartex" xmlns:cx5="http://schemas.microsoft.com/office/drawing/2016/5/11/chartex" xmlns:cx6="http://schemas.microsoft.com/office/drawing/2016/5/12/chartex" xmlns:cx7="http://schemas.microsoft.com/office/drawing/2016/5/13/chartex" xmlns:cx8="http://schemas.microsoft.com/office/drawing/2016/5/14/chartex" xmlns:mc="http://schemas.openxmlformats.org/markup-compatibility/2006" xmlns:m="http://schemas.openxmlformats.org/officeDocument/2006/math" xmlns:aink="http://schemas.microsoft.com/office/drawing/2016/ink" xmlns:am3d="http://schemas.microsoft.com/office/drawing/2017/model3d" xmlns:oel="http://schemas.microsoft.com/office/2019/extlst" xmlns:r="http://schemas.openxmlformats.org/officeDocument/2006/relationships" xmlns:wp14="http://schemas.microsoft.com/office/word/2010/wordprocessingDrawing" xmlns:wp="http://schemas.openxmlformats.org/drawingml/2006/wordprocessingDrawing" xmlns:wpg="http://schemas.microsoft.com/office/word/2010/wordprocessingGroup" xmlns:wpi="http://schemas.microsoft.com/office/word/2010/wordprocessingInk" xmlns:wps="http://schemas.microsoft.com/office/word/2010/wordprocessingShape" xmlns:o="urn:schemas-microsoft-com:office:office" xmlns:v="urn:schemas-microsoft-com:vml" xmlns:w10="urn:schemas-microsoft-com:office:word" xmlns:w="http://schemas.openxmlformats.org/wordprocessingml/2006/main" xmlns:w14="http://schemas.microsoft.com/office/word/2010/wordml" xmlns:w15="http://schemas.microsoft.com/office/word/2012/wordml" xmlns:w16cex="http://schemas.microsoft.com/office/word/2018/wordml/cex" xmlns:w16cid="http://schemas.microsoft.com/office/word/2016/wordml/cid" xmlns:w16="http://schemas.microsoft.com/office/word/2018/wordml" xmlns:w16sdtdh="http://schemas.microsoft.com/office/word/2020/wordml/sdtdatahash" xmlns:w16sdtfl="http://schemas.microsoft.com/office/word/2024/wordml/sdtformatlock" xmlns:w16se="http://schemas.microsoft.com/office/word/2015/wordml/symex" xmlns:w16du="http://schemas.microsoft.com/office/word/2023/wordml/word16du" xmlns:wne="http://schemas.microsoft.com/office/word/2006/wordml" mc:Ignorable="w14 w15 w16se w16cid w16 w16cex w16sdtdh w16sdtfl w16du wp14">
   <w:sdt>
     <w:sdtPr>
       <w:rPr>
@@ -1824,7 +1712,7 @@
 </file>
 
 <file path=word/footnotes.xml><?xml version="1.0" encoding="utf-8"?>
-<w:footnotes xmlns:wpc="http://schemas.microsoft.com/office/word/2010/wordprocessingCanvas" xmlns:cx="http://schemas.microsoft.com/office/drawing/2014/chartex" xmlns:cx1="http://schemas.microsoft.com/office/drawing/2015/9/8/chartex" xmlns:cx2="http://schemas.microsoft.com/office/drawing/2015/10/21/chartex" xmlns:cx3="http://schemas.microsoft.com/office/drawing/2016/5/9/chartex" xmlns:cx4="http://schemas.microsoft.com/office/drawing/2016/5/10/chartex" xmlns:cx5="http://schemas.microsoft.com/office/drawing/2016/5/11/chartex" xmlns:cx6="http://schemas.microsoft.com/office/drawing/2016/5/12/chartex" xmlns:cx7="http://schemas.microsoft.com/office/drawing/2016/5/13/chartex" xmlns:cx8="http://schemas.microsoft.com/office/drawing/2016/5/14/chartex" xmlns:mc="http://schemas.openxmlformats.org/markup-compatibility/2006" xmlns:aink="http://schemas.microsoft.com/office/drawing/2016/ink" xmlns:am3d="http://schemas.microsoft.com/office/drawing/2017/model3d" xmlns:o="urn:schemas-microsoft-com:office:office" xmlns:oel="http://schemas.microsoft.com/office/2019/extlst" xmlns:r="http://schemas.openxmlformats.org/officeDocument/2006/relationships" xmlns:m="http://schemas.openxmlformats.org/officeDocument/2006/math" xmlns:v="urn:schemas-microsoft-com:vml" xmlns:wp14="http://schemas.microsoft.com/office/word/2010/wordprocessingDrawing" xmlns:wp="http://schemas.openxmlformats.org/drawingml/2006/wordprocessingDrawing" xmlns:w10="urn:schemas-microsoft-com:office:word" xmlns:w="http://schemas.openxmlformats.org/wordprocessingml/2006/main" xmlns:w14="http://schemas.microsoft.com/office/word/2010/wordml" xmlns:w15="http://schemas.microsoft.com/office/word/2012/wordml" xmlns:w16cex="http://schemas.microsoft.com/office/word/2018/wordml/cex" xmlns:w16cid="http://schemas.microsoft.com/office/word/2016/wordml/cid" xmlns:w16="http://schemas.microsoft.com/office/word/2018/wordml" xmlns:w16sdtdh="http://schemas.microsoft.com/office/word/2020/wordml/sdtdatahash" xmlns:w16se="http://schemas.microsoft.com/office/word/2015/wordml/symex" xmlns:wpg="http://schemas.microsoft.com/office/word/2010/wordprocessingGroup" xmlns:wpi="http://schemas.microsoft.com/office/word/2010/wordprocessingInk" xmlns:wne="http://schemas.microsoft.com/office/word/2006/wordml" xmlns:wps="http://schemas.microsoft.com/office/word/2010/wordprocessingShape" mc:Ignorable="w14 w15 w16se w16cid w16 w16cex w16sdtdh wp14">
+<w:footnotes xmlns:wpc="http://schemas.microsoft.com/office/word/2010/wordprocessingCanvas" xmlns:cx="http://schemas.microsoft.com/office/drawing/2014/chartex" xmlns:cx1="http://schemas.microsoft.com/office/drawing/2015/9/8/chartex" xmlns:cx2="http://schemas.microsoft.com/office/drawing/2015/10/21/chartex" xmlns:cx3="http://schemas.microsoft.com/office/drawing/2016/5/9/chartex" xmlns:cx4="http://schemas.microsoft.com/office/drawing/2016/5/10/chartex" xmlns:cx5="http://schemas.microsoft.com/office/drawing/2016/5/11/chartex" xmlns:cx6="http://schemas.microsoft.com/office/drawing/2016/5/12/chartex" xmlns:cx7="http://schemas.microsoft.com/office/drawing/2016/5/13/chartex" xmlns:cx8="http://schemas.microsoft.com/office/drawing/2016/5/14/chartex" xmlns:mc="http://schemas.openxmlformats.org/markup-compatibility/2006" xmlns:m="http://schemas.openxmlformats.org/officeDocument/2006/math" xmlns:aink="http://schemas.microsoft.com/office/drawing/2016/ink" xmlns:am3d="http://schemas.microsoft.com/office/drawing/2017/model3d" xmlns:oel="http://schemas.microsoft.com/office/2019/extlst" xmlns:r="http://schemas.openxmlformats.org/officeDocument/2006/relationships" xmlns:wp14="http://schemas.microsoft.com/office/word/2010/wordprocessingDrawing" xmlns:wp="http://schemas.openxmlformats.org/drawingml/2006/wordprocessingDrawing" xmlns:wpg="http://schemas.microsoft.com/office/word/2010/wordprocessingGroup" xmlns:wpi="http://schemas.microsoft.com/office/word/2010/wordprocessingInk" xmlns:wps="http://schemas.microsoft.com/office/word/2010/wordprocessingShape" xmlns:o="urn:schemas-microsoft-com:office:office" xmlns:v="urn:schemas-microsoft-com:vml" xmlns:w10="urn:schemas-microsoft-com:office:word" xmlns:w="http://schemas.openxmlformats.org/wordprocessingml/2006/main" xmlns:w14="http://schemas.microsoft.com/office/word/2010/wordml" xmlns:w15="http://schemas.microsoft.com/office/word/2012/wordml" xmlns:w16cex="http://schemas.microsoft.com/office/word/2018/wordml/cex" xmlns:w16cid="http://schemas.microsoft.com/office/word/2016/wordml/cid" xmlns:w16="http://schemas.microsoft.com/office/word/2018/wordml" xmlns:w16sdtdh="http://schemas.microsoft.com/office/word/2020/wordml/sdtdatahash" xmlns:w16sdtfl="http://schemas.microsoft.com/office/word/2024/wordml/sdtformatlock" xmlns:w16se="http://schemas.microsoft.com/office/word/2015/wordml/symex" xmlns:w16du="http://schemas.microsoft.com/office/word/2023/wordml/word16du" xmlns:wne="http://schemas.microsoft.com/office/word/2006/wordml" mc:Ignorable="w14 w15 w16se w16cid w16 w16cex w16sdtdh w16sdtfl w16du wp14">
   <w:footnote w:type="separator" w:id="-1">
     <w:p>
       <w:r>
@@ -1843,7 +1731,7 @@
 </file>
 
 <file path=word/header1.xml><?xml version="1.0" encoding="utf-8"?>
-<w:hdr xmlns:wpc="http://schemas.microsoft.com/office/word/2010/wordprocessingCanvas" xmlns:cx="http://schemas.microsoft.com/office/drawing/2014/chartex" xmlns:cx1="http://schemas.microsoft.com/office/drawing/2015/9/8/chartex" xmlns:cx2="http://schemas.microsoft.com/office/drawing/2015/10/21/chartex" xmlns:cx3="http://schemas.microsoft.com/office/drawing/2016/5/9/chartex" xmlns:cx4="http://schemas.microsoft.com/office/drawing/2016/5/10/chartex" xmlns:cx5="http://schemas.microsoft.com/office/drawing/2016/5/11/chartex" xmlns:cx6="http://schemas.microsoft.com/office/drawing/2016/5/12/chartex" xmlns:cx7="http://schemas.microsoft.com/office/drawing/2016/5/13/chartex" xmlns:cx8="http://schemas.microsoft.com/office/drawing/2016/5/14/chartex" xmlns:mc="http://schemas.openxmlformats.org/markup-compatibility/2006" xmlns:aink="http://schemas.microsoft.com/office/drawing/2016/ink" xmlns:am3d="http://schemas.microsoft.com/office/drawing/2017/model3d" xmlns:o="urn:schemas-microsoft-com:office:office" xmlns:oel="http://schemas.microsoft.com/office/2019/extlst" xmlns:r="http://schemas.openxmlformats.org/officeDocument/2006/relationships" xmlns:m="http://schemas.openxmlformats.org/officeDocument/2006/math" xmlns:v="urn:schemas-microsoft-com:vml" xmlns:wp14="http://schemas.microsoft.com/office/word/2010/wordprocessingDrawing" xmlns:wp="http://schemas.openxmlformats.org/drawingml/2006/wordprocessingDrawing" xmlns:w10="urn:schemas-microsoft-com:office:word" xmlns:w="http://schemas.openxmlformats.org/wordprocessingml/2006/main" xmlns:w14="http://schemas.microsoft.com/office/word/2010/wordml" xmlns:w15="http://schemas.microsoft.com/office/word/2012/wordml" xmlns:w16cex="http://schemas.microsoft.com/office/word/2018/wordml/cex" xmlns:w16cid="http://schemas.microsoft.com/office/word/2016/wordml/cid" xmlns:w16="http://schemas.microsoft.com/office/word/2018/wordml" xmlns:w16sdtdh="http://schemas.microsoft.com/office/word/2020/wordml/sdtdatahash" xmlns:w16se="http://schemas.microsoft.com/office/word/2015/wordml/symex" xmlns:wpg="http://schemas.microsoft.com/office/word/2010/wordprocessingGroup" xmlns:wpi="http://schemas.microsoft.com/office/word/2010/wordprocessingInk" xmlns:wne="http://schemas.microsoft.com/office/word/2006/wordml" xmlns:wps="http://schemas.microsoft.com/office/word/2010/wordprocessingShape" mc:Ignorable="w14 w15 w16se w16cid w16 w16cex w16sdtdh wp14">
+<w:hdr xmlns:wpc="http://schemas.microsoft.com/office/word/2010/wordprocessingCanvas" xmlns:cx="http://schemas.microsoft.com/office/drawing/2014/chartex" xmlns:cx1="http://schemas.microsoft.com/office/drawing/2015/9/8/chartex" xmlns:cx2="http://schemas.microsoft.com/office/drawing/2015/10/21/chartex" xmlns:cx3="http://schemas.microsoft.com/office/drawing/2016/5/9/chartex" xmlns:cx4="http://schemas.microsoft.com/office/drawing/2016/5/10/chartex" xmlns:cx5="http://schemas.microsoft.com/office/drawing/2016/5/11/chartex" xmlns:cx6="http://schemas.microsoft.com/office/drawing/2016/5/12/chartex" xmlns:cx7="http://schemas.microsoft.com/office/drawing/2016/5/13/chartex" xmlns:cx8="http://schemas.microsoft.com/office/drawing/2016/5/14/chartex" xmlns:mc="http://schemas.openxmlformats.org/markup-compatibility/2006" xmlns:m="http://schemas.openxmlformats.org/officeDocument/2006/math" xmlns:aink="http://schemas.microsoft.com/office/drawing/2016/ink" xmlns:am3d="http://schemas.microsoft.com/office/drawing/2017/model3d" xmlns:oel="http://schemas.microsoft.com/office/2019/extlst" xmlns:r="http://schemas.openxmlformats.org/officeDocument/2006/relationships" xmlns:wp14="http://schemas.microsoft.com/office/word/2010/wordprocessingDrawing" xmlns:wp="http://schemas.openxmlformats.org/drawingml/2006/wordprocessingDrawing" xmlns:wpg="http://schemas.microsoft.com/office/word/2010/wordprocessingGroup" xmlns:wpi="http://schemas.microsoft.com/office/word/2010/wordprocessingInk" xmlns:wps="http://schemas.microsoft.com/office/word/2010/wordprocessingShape" xmlns:o="urn:schemas-microsoft-com:office:office" xmlns:v="urn:schemas-microsoft-com:vml" xmlns:w10="urn:schemas-microsoft-com:office:word" xmlns:w="http://schemas.openxmlformats.org/wordprocessingml/2006/main" xmlns:w14="http://schemas.microsoft.com/office/word/2010/wordml" xmlns:w15="http://schemas.microsoft.com/office/word/2012/wordml" xmlns:w16cex="http://schemas.microsoft.com/office/word/2018/wordml/cex" xmlns:w16cid="http://schemas.microsoft.com/office/word/2016/wordml/cid" xmlns:w16="http://schemas.microsoft.com/office/word/2018/wordml" xmlns:w16sdtdh="http://schemas.microsoft.com/office/word/2020/wordml/sdtdatahash" xmlns:w16sdtfl="http://schemas.microsoft.com/office/word/2024/wordml/sdtformatlock" xmlns:w16se="http://schemas.microsoft.com/office/word/2015/wordml/symex" xmlns:w16du="http://schemas.microsoft.com/office/word/2023/wordml/word16du" xmlns:wne="http://schemas.microsoft.com/office/word/2006/wordml" mc:Ignorable="w14 w15 w16se w16cid w16 w16cex w16sdtdh w16sdtfl w16du wp14">
   <w:p>
     <w:pPr>
       <w:pStyle w:val="Header"/>
@@ -1859,7 +1747,7 @@
         <w:lang w:eastAsia="da-DK"/>
       </w:rPr>
       <w:drawing>
-        <wp:anchor distT="0" distB="0" distL="114300" distR="114300" simplePos="0" relativeHeight="251659264" behindDoc="1" locked="0" layoutInCell="1" allowOverlap="1">
+        <wp:anchor distT="0" distB="0" distL="114300" distR="114300" simplePos="0" relativeHeight="251659264" behindDoc="1" locked="0" layoutInCell="1" allowOverlap="1" wp14:anchorId="0B006C15" wp14:editId="2A3F139C">
           <wp:simplePos x="0" y="0"/>
           <wp:positionH relativeFrom="column">
             <wp:posOffset>-2540</wp:posOffset>
@@ -2059,7 +1947,7 @@
 </file>
 
 <file path=word/numbering.xml><?xml version="1.0" encoding="utf-8"?>
-<w:numbering xmlns:wpc="http://schemas.microsoft.com/office/word/2010/wordprocessingCanvas" xmlns:cx="http://schemas.microsoft.com/office/drawing/2014/chartex" xmlns:cx1="http://schemas.microsoft.com/office/drawing/2015/9/8/chartex" xmlns:cx2="http://schemas.microsoft.com/office/drawing/2015/10/21/chartex" xmlns:cx3="http://schemas.microsoft.com/office/drawing/2016/5/9/chartex" xmlns:cx4="http://schemas.microsoft.com/office/drawing/2016/5/10/chartex" xmlns:cx5="http://schemas.microsoft.com/office/drawing/2016/5/11/chartex" xmlns:cx6="http://schemas.microsoft.com/office/drawing/2016/5/12/chartex" xmlns:cx7="http://schemas.microsoft.com/office/drawing/2016/5/13/chartex" xmlns:cx8="http://schemas.microsoft.com/office/drawing/2016/5/14/chartex" xmlns:mc="http://schemas.openxmlformats.org/markup-compatibility/2006" xmlns:aink="http://schemas.microsoft.com/office/drawing/2016/ink" xmlns:am3d="http://schemas.microsoft.com/office/drawing/2017/model3d" xmlns:o="urn:schemas-microsoft-com:office:office" xmlns:oel="http://schemas.microsoft.com/office/2019/extlst" xmlns:r="http://schemas.openxmlformats.org/officeDocument/2006/relationships" xmlns:m="http://schemas.openxmlformats.org/officeDocument/2006/math" xmlns:v="urn:schemas-microsoft-com:vml" xmlns:wp14="http://schemas.microsoft.com/office/word/2010/wordprocessingDrawing" xmlns:wp="http://schemas.openxmlformats.org/drawingml/2006/wordprocessingDrawing" xmlns:w10="urn:schemas-microsoft-com:office:word" xmlns:w="http://schemas.openxmlformats.org/wordprocessingml/2006/main" xmlns:w14="http://schemas.microsoft.com/office/word/2010/wordml" xmlns:w15="http://schemas.microsoft.com/office/word/2012/wordml" xmlns:w16cex="http://schemas.microsoft.com/office/word/2018/wordml/cex" xmlns:w16cid="http://schemas.microsoft.com/office/word/2016/wordml/cid" xmlns:w16="http://schemas.microsoft.com/office/word/2018/wordml" xmlns:w16sdtdh="http://schemas.microsoft.com/office/word/2020/wordml/sdtdatahash" xmlns:w16se="http://schemas.microsoft.com/office/word/2015/wordml/symex" xmlns:wpg="http://schemas.microsoft.com/office/word/2010/wordprocessingGroup" xmlns:wpi="http://schemas.microsoft.com/office/word/2010/wordprocessingInk" xmlns:wne="http://schemas.microsoft.com/office/word/2006/wordml" xmlns:wps="http://schemas.microsoft.com/office/word/2010/wordprocessingShape" mc:Ignorable="w14 w15 w16se w16cid w16 w16cex w16sdtdh wp14">
+<w:numbering xmlns:wpc="http://schemas.microsoft.com/office/word/2010/wordprocessingCanvas" xmlns:cx="http://schemas.microsoft.com/office/drawing/2014/chartex" xmlns:cx1="http://schemas.microsoft.com/office/drawing/2015/9/8/chartex" xmlns:cx2="http://schemas.microsoft.com/office/drawing/2015/10/21/chartex" xmlns:cx3="http://schemas.microsoft.com/office/drawing/2016/5/9/chartex" xmlns:cx4="http://schemas.microsoft.com/office/drawing/2016/5/10/chartex" xmlns:cx5="http://schemas.microsoft.com/office/drawing/2016/5/11/chartex" xmlns:cx6="http://schemas.microsoft.com/office/drawing/2016/5/12/chartex" xmlns:cx7="http://schemas.microsoft.com/office/drawing/2016/5/13/chartex" xmlns:cx8="http://schemas.microsoft.com/office/drawing/2016/5/14/chartex" xmlns:mc="http://schemas.openxmlformats.org/markup-compatibility/2006" xmlns:m="http://schemas.openxmlformats.org/officeDocument/2006/math" xmlns:aink="http://schemas.microsoft.com/office/drawing/2016/ink" xmlns:am3d="http://schemas.microsoft.com/office/drawing/2017/model3d" xmlns:oel="http://schemas.microsoft.com/office/2019/extlst" xmlns:r="http://schemas.openxmlformats.org/officeDocument/2006/relationships" xmlns:wp14="http://schemas.microsoft.com/office/word/2010/wordprocessingDrawing" xmlns:wp="http://schemas.openxmlformats.org/drawingml/2006/wordprocessingDrawing" xmlns:wpg="http://schemas.microsoft.com/office/word/2010/wordprocessingGroup" xmlns:wpi="http://schemas.microsoft.com/office/word/2010/wordprocessingInk" xmlns:wps="http://schemas.microsoft.com/office/word/2010/wordprocessingShape" xmlns:o="urn:schemas-microsoft-com:office:office" xmlns:v="urn:schemas-microsoft-com:vml" xmlns:w10="urn:schemas-microsoft-com:office:word" xmlns:w="http://schemas.openxmlformats.org/wordprocessingml/2006/main" xmlns:w14="http://schemas.microsoft.com/office/word/2010/wordml" xmlns:w15="http://schemas.microsoft.com/office/word/2012/wordml" xmlns:w16cex="http://schemas.microsoft.com/office/word/2018/wordml/cex" xmlns:w16cid="http://schemas.microsoft.com/office/word/2016/wordml/cid" xmlns:w16="http://schemas.microsoft.com/office/word/2018/wordml" xmlns:w16sdtdh="http://schemas.microsoft.com/office/word/2020/wordml/sdtdatahash" xmlns:w16sdtfl="http://schemas.microsoft.com/office/word/2024/wordml/sdtformatlock" xmlns:w16se="http://schemas.microsoft.com/office/word/2015/wordml/symex" xmlns:w16du="http://schemas.microsoft.com/office/word/2023/wordml/word16du" xmlns:wne="http://schemas.microsoft.com/office/word/2006/wordml" mc:Ignorable="w14 w15 w16se w16cid w16 w16cex w16sdtdh w16sdtfl w16du wp14">
   <w:abstractNum w:abstractNumId="0" w15:restartNumberingAfterBreak="0">
     <w:nsid w:val="2DFB2120"/>
     <w:multiLevelType w:val="hybridMultilevel"/>
@@ -2421,7 +2309,7 @@
 </file>
 
 <file path=word/styles.xml><?xml version="1.0" encoding="utf-8"?>
-<w:styles xmlns:mc="http://schemas.openxmlformats.org/markup-compatibility/2006" xmlns:r="http://schemas.openxmlformats.org/officeDocument/2006/relationships" xmlns:w="http://schemas.openxmlformats.org/wordprocessingml/2006/main" xmlns:w14="http://schemas.microsoft.com/office/word/2010/wordml" xmlns:w15="http://schemas.microsoft.com/office/word/2012/wordml" xmlns:w16cex="http://schemas.microsoft.com/office/word/2018/wordml/cex" xmlns:w16cid="http://schemas.microsoft.com/office/word/2016/wordml/cid" xmlns:w16="http://schemas.microsoft.com/office/word/2018/wordml" xmlns:w16sdtdh="http://schemas.microsoft.com/office/word/2020/wordml/sdtdatahash" xmlns:w16se="http://schemas.microsoft.com/office/word/2015/wordml/symex" mc:Ignorable="w14 w15 w16se w16cid w16 w16cex w16sdtdh">
+<w:styles xmlns:mc="http://schemas.openxmlformats.org/markup-compatibility/2006" xmlns:r="http://schemas.openxmlformats.org/officeDocument/2006/relationships" xmlns:w="http://schemas.openxmlformats.org/wordprocessingml/2006/main" xmlns:w14="http://schemas.microsoft.com/office/word/2010/wordml" xmlns:w15="http://schemas.microsoft.com/office/word/2012/wordml" xmlns:w16cex="http://schemas.microsoft.com/office/word/2018/wordml/cex" xmlns:w16cid="http://schemas.microsoft.com/office/word/2016/wordml/cid" xmlns:w16="http://schemas.microsoft.com/office/word/2018/wordml" xmlns:w16sdtdh="http://schemas.microsoft.com/office/word/2020/wordml/sdtdatahash" xmlns:w16sdtfl="http://schemas.microsoft.com/office/word/2024/wordml/sdtformatlock" xmlns:w16se="http://schemas.microsoft.com/office/word/2015/wordml/symex" xmlns:w16du="http://schemas.microsoft.com/office/word/2023/wordml/word16du" mc:Ignorable="w14 w15 w16se w16cid w16 w16cex w16sdtdh w16sdtfl w16du">
   <w:docDefaults>
     <w:rPrDefault>
       <w:rPr>

</xml_diff>

<commit_message>
opdateret ECG pdf til at matche docx versionen
</commit_message>
<xml_diff>
--- a/01 Intro + Opsamling + Interfaces/Interfaces - ECG.DOCX
+++ b/01 Intro + Opsamling + Interfaces/Interfaces - ECG.DOCX
@@ -1,6 +1,6 @@
 
 <file path=word/document.xml><?xml version="1.0" encoding="utf-8"?>
-<w:document xmlns:wpc="http://schemas.microsoft.com/office/word/2010/wordprocessingCanvas" xmlns:cx="http://schemas.microsoft.com/office/drawing/2014/chartex" xmlns:cx1="http://schemas.microsoft.com/office/drawing/2015/9/8/chartex" xmlns:cx2="http://schemas.microsoft.com/office/drawing/2015/10/21/chartex" xmlns:cx3="http://schemas.microsoft.com/office/drawing/2016/5/9/chartex" xmlns:cx4="http://schemas.microsoft.com/office/drawing/2016/5/10/chartex" xmlns:cx5="http://schemas.microsoft.com/office/drawing/2016/5/11/chartex" xmlns:cx6="http://schemas.microsoft.com/office/drawing/2016/5/12/chartex" xmlns:cx7="http://schemas.microsoft.com/office/drawing/2016/5/13/chartex" xmlns:cx8="http://schemas.microsoft.com/office/drawing/2016/5/14/chartex" xmlns:mc="http://schemas.openxmlformats.org/markup-compatibility/2006" xmlns:m="http://schemas.openxmlformats.org/officeDocument/2006/math" xmlns:aink="http://schemas.microsoft.com/office/drawing/2016/ink" xmlns:am3d="http://schemas.microsoft.com/office/drawing/2017/model3d" xmlns:oel="http://schemas.microsoft.com/office/2019/extlst" xmlns:r="http://schemas.openxmlformats.org/officeDocument/2006/relationships" xmlns:wp14="http://schemas.microsoft.com/office/word/2010/wordprocessingDrawing" xmlns:wp="http://schemas.openxmlformats.org/drawingml/2006/wordprocessingDrawing" xmlns:wpg="http://schemas.microsoft.com/office/word/2010/wordprocessingGroup" xmlns:wpi="http://schemas.microsoft.com/office/word/2010/wordprocessingInk" xmlns:wps="http://schemas.microsoft.com/office/word/2010/wordprocessingShape" xmlns:o="urn:schemas-microsoft-com:office:office" xmlns:v="urn:schemas-microsoft-com:vml" xmlns:w10="urn:schemas-microsoft-com:office:word" xmlns:w="http://schemas.openxmlformats.org/wordprocessingml/2006/main" xmlns:w14="http://schemas.microsoft.com/office/word/2010/wordml" xmlns:w15="http://schemas.microsoft.com/office/word/2012/wordml" xmlns:w16cex="http://schemas.microsoft.com/office/word/2018/wordml/cex" xmlns:w16cid="http://schemas.microsoft.com/office/word/2016/wordml/cid" xmlns:w16="http://schemas.microsoft.com/office/word/2018/wordml" xmlns:w16sdtdh="http://schemas.microsoft.com/office/word/2020/wordml/sdtdatahash" xmlns:w16sdtfl="http://schemas.microsoft.com/office/word/2024/wordml/sdtformatlock" xmlns:w16se="http://schemas.microsoft.com/office/word/2015/wordml/symex" xmlns:w16du="http://schemas.microsoft.com/office/word/2023/wordml/word16du" xmlns:wne="http://schemas.microsoft.com/office/word/2006/wordml" mc:Ignorable="w14 w15 w16se w16cid w16 w16cex w16sdtdh w16sdtfl w16du wp14">
+<w:document xmlns:wpc="http://schemas.microsoft.com/office/word/2010/wordprocessingCanvas" xmlns:cx="http://schemas.microsoft.com/office/drawing/2014/chartex" xmlns:cx1="http://schemas.microsoft.com/office/drawing/2015/9/8/chartex" xmlns:cx2="http://schemas.microsoft.com/office/drawing/2015/10/21/chartex" xmlns:cx3="http://schemas.microsoft.com/office/drawing/2016/5/9/chartex" xmlns:cx4="http://schemas.microsoft.com/office/drawing/2016/5/10/chartex" xmlns:cx5="http://schemas.microsoft.com/office/drawing/2016/5/11/chartex" xmlns:cx6="http://schemas.microsoft.com/office/drawing/2016/5/12/chartex" xmlns:cx7="http://schemas.microsoft.com/office/drawing/2016/5/13/chartex" xmlns:cx8="http://schemas.microsoft.com/office/drawing/2016/5/14/chartex" xmlns:mc="http://schemas.openxmlformats.org/markup-compatibility/2006" xmlns:aink="http://schemas.microsoft.com/office/drawing/2016/ink" xmlns:am3d="http://schemas.microsoft.com/office/drawing/2017/model3d" xmlns:o="urn:schemas-microsoft-com:office:office" xmlns:oel="http://schemas.microsoft.com/office/2019/extlst" xmlns:r="http://schemas.openxmlformats.org/officeDocument/2006/relationships" xmlns:m="http://schemas.openxmlformats.org/officeDocument/2006/math" xmlns:v="urn:schemas-microsoft-com:vml" xmlns:wp14="http://schemas.microsoft.com/office/word/2010/wordprocessingDrawing" xmlns:wp="http://schemas.openxmlformats.org/drawingml/2006/wordprocessingDrawing" xmlns:w10="urn:schemas-microsoft-com:office:word" xmlns:w="http://schemas.openxmlformats.org/wordprocessingml/2006/main" xmlns:w14="http://schemas.microsoft.com/office/word/2010/wordml" xmlns:w15="http://schemas.microsoft.com/office/word/2012/wordml" xmlns:w16cex="http://schemas.microsoft.com/office/word/2018/wordml/cex" xmlns:w16cid="http://schemas.microsoft.com/office/word/2016/wordml/cid" xmlns:w16="http://schemas.microsoft.com/office/word/2018/wordml" xmlns:w16du="http://schemas.microsoft.com/office/word/2023/wordml/word16du" xmlns:w16sdtdh="http://schemas.microsoft.com/office/word/2020/wordml/sdtdatahash" xmlns:w16sdtfl="http://schemas.microsoft.com/office/word/2024/wordml/sdtformatlock" xmlns:w16se="http://schemas.microsoft.com/office/word/2015/wordml/symex" xmlns:wpg="http://schemas.microsoft.com/office/word/2010/wordprocessingGroup" xmlns:wpi="http://schemas.microsoft.com/office/word/2010/wordprocessingInk" xmlns:wne="http://schemas.microsoft.com/office/word/2006/wordml" xmlns:wps="http://schemas.microsoft.com/office/word/2010/wordprocessingShape" mc:Ignorable="w14 w15 w16se w16cid w16 w16cex w16sdtdh w16sdtfl w16du wp14">
   <w:body>
     <w:p>
       <w:pPr>
@@ -283,10 +283,10 @@
             <v:path o:extrusionok="f" gradientshapeok="t" o:connecttype="rect"/>
             <o:lock v:ext="edit" aspectratio="t"/>
           </v:shapetype>
-          <v:shape id="_x0000_i1027" type="#_x0000_t75" alt="" style="width:329pt;height:140.1pt;mso-width-percent:0;mso-height-percent:0;mso-width-percent:0;mso-height-percent:0" o:ole="">
+          <v:shape id="_x0000_i1025" type="#_x0000_t75" alt="" style="width:329.05pt;height:140pt;mso-width-percent:0;mso-height-percent:0;mso-width-percent:0;mso-height-percent:0" o:ole="">
             <v:imagedata r:id="rId8" o:title=""/>
           </v:shape>
-          <o:OLEObject Type="Embed" ProgID="Visio.Drawing.15" ShapeID="_x0000_i1027" DrawAspect="Content" ObjectID="_1844920350" r:id="rId9"/>
+          <o:OLEObject Type="Embed" ProgID="Visio.Drawing.15" ShapeID="_x0000_i1025" DrawAspect="Content" ObjectID="_1849326779" r:id="rId9"/>
         </w:object>
       </w:r>
     </w:p>
@@ -359,6 +359,7 @@
         </w:rPr>
         <w:t xml:space="preserve">The </w:t>
       </w:r>
+      <w:proofErr w:type="gramStart"/>
       <w:r>
         <w:rPr>
           <w:rStyle w:val="CodeChar"/>
@@ -371,7 +372,15 @@
           <w:rStyle w:val="CodeChar"/>
           <w:lang w:val="en-US"/>
         </w:rPr>
-        <w:t>()</w:t>
+        <w:t>(</w:t>
+      </w:r>
+      <w:proofErr w:type="gramEnd"/>
+      <w:r>
+        <w:rPr>
+          <w:rStyle w:val="CodeChar"/>
+          <w:lang w:val="en-US"/>
+        </w:rPr>
+        <w:t>)</w:t>
       </w:r>
       <w:r>
         <w:rPr>
@@ -404,6 +413,7 @@
         </w:rPr>
         <w:t xml:space="preserve">The </w:t>
       </w:r>
+      <w:proofErr w:type="gramStart"/>
       <w:r>
         <w:rPr>
           <w:rFonts w:ascii="Consolas" w:hAnsi="Consolas"/>
@@ -411,14 +421,9 @@
           <w:szCs w:val="18"/>
           <w:lang w:val="en-US"/>
         </w:rPr>
-        <w:t>Count()</w:t>
-      </w:r>
-      <w:r>
-        <w:rPr>
-          <w:lang w:val="en-US"/>
-        </w:rPr>
-        <w:t xml:space="preserve"> method returns the size of the </w:t>
-      </w:r>
+        <w:t>Count(</w:t>
+      </w:r>
+      <w:proofErr w:type="gramEnd"/>
       <w:r>
         <w:rPr>
           <w:rFonts w:ascii="Consolas" w:hAnsi="Consolas"/>
@@ -426,6 +431,21 @@
           <w:szCs w:val="18"/>
           <w:lang w:val="en-US"/>
         </w:rPr>
+        <w:t>)</w:t>
+      </w:r>
+      <w:r>
+        <w:rPr>
+          <w:lang w:val="en-US"/>
+        </w:rPr>
+        <w:t xml:space="preserve"> method returns the size of the </w:t>
+      </w:r>
+      <w:r>
+        <w:rPr>
+          <w:rFonts w:ascii="Consolas" w:hAnsi="Consolas"/>
+          <w:sz w:val="18"/>
+          <w:szCs w:val="18"/>
+          <w:lang w:val="en-US"/>
+        </w:rPr>
         <w:t>_samples</w:t>
       </w:r>
       <w:r>
@@ -451,10 +471,10 @@
           <w:noProof/>
         </w:rPr>
         <w:object w:dxaOrig="6841" w:dyaOrig="1741" w14:anchorId="6219A4D3">
-          <v:shape id="_x0000_i1026" type="#_x0000_t75" alt="" style="width:342.3pt;height:86.95pt;mso-width-percent:0;mso-height-percent:0;mso-width-percent:0;mso-height-percent:0" o:ole="">
+          <v:shape id="_x0000_i1026" type="#_x0000_t75" alt="" style="width:342.55pt;height:87pt;mso-width-percent:0;mso-height-percent:0;mso-width-percent:0;mso-height-percent:0" o:ole="">
             <v:imagedata r:id="rId10" o:title=""/>
           </v:shape>
-          <o:OLEObject Type="Embed" ProgID="Visio.Drawing.15" ShapeID="_x0000_i1026" DrawAspect="Content" ObjectID="_1844920351" r:id="rId11"/>
+          <o:OLEObject Type="Embed" ProgID="Visio.Drawing.15" ShapeID="_x0000_i1026" DrawAspect="Content" ObjectID="_1849326780" r:id="rId11"/>
         </w:object>
       </w:r>
     </w:p>
@@ -665,12 +685,21 @@
         </w:rPr>
         <w:t xml:space="preserve">Implement your design. Use the provided </w:t>
       </w:r>
+      <w:proofErr w:type="gramStart"/>
       <w:r>
         <w:rPr>
           <w:rStyle w:val="CodeChar"/>
           <w:lang w:val="en-US"/>
         </w:rPr>
-        <w:t>Main()</w:t>
+        <w:t>Main(</w:t>
+      </w:r>
+      <w:proofErr w:type="gramEnd"/>
+      <w:r>
+        <w:rPr>
+          <w:rStyle w:val="CodeChar"/>
+          <w:lang w:val="en-US"/>
+        </w:rPr>
+        <w:t>)</w:t>
       </w:r>
       <w:r>
         <w:rPr>
@@ -682,7 +711,14 @@
         <w:rPr>
           <w:lang w:val="en-US"/>
         </w:rPr>
-        <w:t>method in the P</w:t>
+        <w:t xml:space="preserve">method in the </w:t>
+      </w:r>
+      <w:proofErr w:type="spellStart"/>
+      <w:r>
+        <w:rPr>
+          <w:lang w:val="en-US"/>
+        </w:rPr>
+        <w:t>P</w:t>
       </w:r>
       <w:r>
         <w:rPr>
@@ -694,13 +730,34 @@
         <w:rPr>
           <w:lang w:val="en-US"/>
         </w:rPr>
-        <w:t>.cs file, which</w:t>
-      </w:r>
-      <w:r>
-        <w:rPr>
-          <w:lang w:val="en-US"/>
-        </w:rPr>
-        <w:t xml:space="preserve"> tests your program by adding some samples and prints them </w:t>
+        <w:t>.cs</w:t>
+      </w:r>
+      <w:proofErr w:type="spellEnd"/>
+      <w:r>
+        <w:rPr>
+          <w:lang w:val="en-US"/>
+        </w:rPr>
+        <w:t xml:space="preserve"> file, which</w:t>
+      </w:r>
+      <w:r>
+        <w:rPr>
+          <w:lang w:val="en-US"/>
+        </w:rPr>
+        <w:t xml:space="preserve"> tests your program by adding some samples and </w:t>
+      </w:r>
+      <w:proofErr w:type="gramStart"/>
+      <w:r>
+        <w:rPr>
+          <w:lang w:val="en-US"/>
+        </w:rPr>
+        <w:t>prints</w:t>
+      </w:r>
+      <w:proofErr w:type="gramEnd"/>
+      <w:r>
+        <w:rPr>
+          <w:lang w:val="en-US"/>
+        </w:rPr>
+        <w:t xml:space="preserve"> them </w:t>
       </w:r>
       <w:r>
         <w:rPr>
@@ -712,14 +769,37 @@
         <w:rPr>
           <w:lang w:val="en-US"/>
         </w:rPr>
-        <w:t xml:space="preserve">. Notice: Did you have to do any changes to the </w:t>
-      </w:r>
+        <w:t xml:space="preserve">. Notice: Did you have to </w:t>
+      </w:r>
+      <w:proofErr w:type="gramStart"/>
+      <w:r>
+        <w:rPr>
+          <w:lang w:val="en-US"/>
+        </w:rPr>
+        <w:t>do</w:t>
+      </w:r>
+      <w:proofErr w:type="gramEnd"/>
+      <w:r>
+        <w:rPr>
+          <w:lang w:val="en-US"/>
+        </w:rPr>
+        <w:t xml:space="preserve"> any changes to the </w:t>
+      </w:r>
+      <w:proofErr w:type="gramStart"/>
       <w:r>
         <w:rPr>
           <w:rStyle w:val="CodeChar"/>
           <w:lang w:val="en-US"/>
         </w:rPr>
-        <w:t>Main()</w:t>
+        <w:t>Main(</w:t>
+      </w:r>
+      <w:proofErr w:type="gramEnd"/>
+      <w:r>
+        <w:rPr>
+          <w:rStyle w:val="CodeChar"/>
+          <w:lang w:val="en-US"/>
+        </w:rPr>
+        <w:t>)</w:t>
       </w:r>
       <w:r>
         <w:rPr>
@@ -737,7 +817,21 @@
         <w:rPr>
           <w:lang w:val="en-US"/>
         </w:rPr>
-        <w:t xml:space="preserve"> to use your new design? No? That’s great! This means that we have implemented the design changes without affecting </w:t>
+        <w:t xml:space="preserve"> to use your new design? No? That’s great! This means that we have implemented </w:t>
+      </w:r>
+      <w:proofErr w:type="gramStart"/>
+      <w:r>
+        <w:rPr>
+          <w:lang w:val="en-US"/>
+        </w:rPr>
+        <w:t>the design</w:t>
+      </w:r>
+      <w:proofErr w:type="gramEnd"/>
+      <w:r>
+        <w:rPr>
+          <w:lang w:val="en-US"/>
+        </w:rPr>
+        <w:t xml:space="preserve"> changes without affecting </w:t>
       </w:r>
       <w:r>
         <w:rPr>
@@ -751,12 +845,21 @@
         </w:rPr>
         <w:t xml:space="preserve">, namely </w:t>
       </w:r>
+      <w:proofErr w:type="gramStart"/>
       <w:r>
         <w:rPr>
           <w:rStyle w:val="CodeChar"/>
           <w:lang w:val="en-US"/>
         </w:rPr>
-        <w:t>Main()</w:t>
+        <w:t>Main(</w:t>
+      </w:r>
+      <w:proofErr w:type="gramEnd"/>
+      <w:r>
+        <w:rPr>
+          <w:rStyle w:val="CodeChar"/>
+          <w:lang w:val="en-US"/>
+        </w:rPr>
+        <w:t>)</w:t>
       </w:r>
       <w:r>
         <w:rPr>
@@ -981,6 +1084,7 @@
         </w:rPr>
         <w:t xml:space="preserve">Add </w:t>
       </w:r>
+      <w:proofErr w:type="spellStart"/>
       <w:r>
         <w:rPr>
           <w:rStyle w:val="CodeChar"/>
@@ -988,6 +1092,7 @@
         </w:rPr>
         <w:t>ExtremesProcessing</w:t>
       </w:r>
+      <w:proofErr w:type="spellEnd"/>
       <w:r>
         <w:rPr>
           <w:lang w:val="en-US"/>
@@ -1012,12 +1117,21 @@
         </w:rPr>
         <w:t xml:space="preserve">your implementation and test it using the same </w:t>
       </w:r>
+      <w:proofErr w:type="gramStart"/>
       <w:r>
         <w:rPr>
           <w:rStyle w:val="CodeChar"/>
           <w:lang w:val="en-US"/>
         </w:rPr>
-        <w:t>Main()</w:t>
+        <w:t>Main(</w:t>
+      </w:r>
+      <w:proofErr w:type="gramEnd"/>
+      <w:r>
+        <w:rPr>
+          <w:rStyle w:val="CodeChar"/>
+          <w:lang w:val="en-US"/>
+        </w:rPr>
+        <w:t>)</w:t>
       </w:r>
       <w:r>
         <w:rPr>
@@ -1029,14 +1143,37 @@
         <w:rPr>
           <w:lang w:val="en-US"/>
         </w:rPr>
-        <w:t xml:space="preserve">program as before. Again note how the </w:t>
-      </w:r>
+        <w:t xml:space="preserve">program as before. </w:t>
+      </w:r>
+      <w:proofErr w:type="gramStart"/>
+      <w:r>
+        <w:rPr>
+          <w:lang w:val="en-US"/>
+        </w:rPr>
+        <w:t>Again</w:t>
+      </w:r>
+      <w:proofErr w:type="gramEnd"/>
+      <w:r>
+        <w:rPr>
+          <w:lang w:val="en-US"/>
+        </w:rPr>
+        <w:t xml:space="preserve"> note how the </w:t>
+      </w:r>
+      <w:proofErr w:type="gramStart"/>
       <w:r>
         <w:rPr>
           <w:rStyle w:val="CodeChar"/>
           <w:lang w:val="en-US"/>
         </w:rPr>
-        <w:t>Main()</w:t>
+        <w:t>Main(</w:t>
+      </w:r>
+      <w:proofErr w:type="gramEnd"/>
+      <w:r>
+        <w:rPr>
+          <w:rStyle w:val="CodeChar"/>
+          <w:lang w:val="en-US"/>
+        </w:rPr>
+        <w:t>)</w:t>
       </w:r>
       <w:r>
         <w:rPr>
@@ -1128,6 +1265,7 @@
         </w:rPr>
         <w:t xml:space="preserve"> can decide which reporting type to use when the program starts. Hint: This requires changes to </w:t>
       </w:r>
+      <w:proofErr w:type="spellStart"/>
       <w:r>
         <w:rPr>
           <w:rStyle w:val="CodeChar"/>
@@ -1139,14 +1277,30 @@
         <w:rPr>
           <w:lang w:val="en-US"/>
         </w:rPr>
-        <w:t xml:space="preserve">’s constructor and therefore to the setup you do in the beginning of </w:t>
-      </w:r>
+        <w:t>’s</w:t>
+      </w:r>
+      <w:proofErr w:type="spellEnd"/>
+      <w:r>
+        <w:rPr>
+          <w:lang w:val="en-US"/>
+        </w:rPr>
+        <w:t xml:space="preserve"> constructor and therefore to the setup you do in the beginning of </w:t>
+      </w:r>
+      <w:proofErr w:type="gramStart"/>
       <w:r>
         <w:rPr>
           <w:rStyle w:val="CodeChar"/>
           <w:lang w:val="en-US"/>
         </w:rPr>
-        <w:t>Main()</w:t>
+        <w:t>Main(</w:t>
+      </w:r>
+      <w:proofErr w:type="gramEnd"/>
+      <w:r>
+        <w:rPr>
+          <w:rStyle w:val="CodeChar"/>
+          <w:lang w:val="en-US"/>
+        </w:rPr>
+        <w:t>)</w:t>
       </w:r>
       <w:r>
         <w:rPr>
@@ -1234,6 +1388,7 @@
         </w:rPr>
         <w:t xml:space="preserve"> </w:t>
       </w:r>
+      <w:proofErr w:type="spellStart"/>
       <w:r>
         <w:rPr>
           <w:rStyle w:val="CodeChar"/>
@@ -1241,11 +1396,26 @@
         </w:rPr>
         <w:t>BPMProcessing</w:t>
       </w:r>
-      <w:r>
-        <w:rPr>
-          <w:lang w:val="en-US"/>
-        </w:rPr>
-        <w:t xml:space="preserve">. This processing </w:t>
+      <w:proofErr w:type="spellEnd"/>
+      <w:r>
+        <w:rPr>
+          <w:lang w:val="en-US"/>
+        </w:rPr>
+        <w:t xml:space="preserve">. This </w:t>
+      </w:r>
+      <w:proofErr w:type="gramStart"/>
+      <w:r>
+        <w:rPr>
+          <w:lang w:val="en-US"/>
+        </w:rPr>
+        <w:t>processing</w:t>
+      </w:r>
+      <w:proofErr w:type="gramEnd"/>
+      <w:r>
+        <w:rPr>
+          <w:lang w:val="en-US"/>
+        </w:rPr>
+        <w:t xml:space="preserve"> </w:t>
       </w:r>
       <w:r>
         <w:rPr>
@@ -1290,11 +1460,19 @@
         </w:rPr>
         <w:t xml:space="preserve">number of </w:t>
       </w:r>
-      <w:r>
-        <w:rPr>
-          <w:lang w:val="en-US"/>
-        </w:rPr>
-        <w:t xml:space="preserve">heartbeats per minute (BPM). </w:t>
+      <w:proofErr w:type="spellStart"/>
+      <w:r>
+        <w:rPr>
+          <w:lang w:val="en-US"/>
+        </w:rPr>
+        <w:t>heartbeats</w:t>
+      </w:r>
+      <w:proofErr w:type="spellEnd"/>
+      <w:r>
+        <w:rPr>
+          <w:lang w:val="en-US"/>
+        </w:rPr>
+        <w:t xml:space="preserve"> per minute (BPM). </w:t>
       </w:r>
       <w:r>
         <w:rPr>
@@ -1431,6 +1609,7 @@
         </w:rPr>
         <w:t xml:space="preserve">After you have added </w:t>
       </w:r>
+      <w:proofErr w:type="spellStart"/>
       <w:r>
         <w:rPr>
           <w:rStyle w:val="CodeChar"/>
@@ -1438,6 +1617,7 @@
         </w:rPr>
         <w:t>BPMProcessing</w:t>
       </w:r>
+      <w:proofErr w:type="spellEnd"/>
       <w:r>
         <w:rPr>
           <w:lang w:val="en-US"/>
@@ -1450,12 +1630,21 @@
         </w:rPr>
         <w:t xml:space="preserve">xtend your </w:t>
       </w:r>
+      <w:proofErr w:type="gramStart"/>
       <w:r>
         <w:rPr>
           <w:rStyle w:val="CodeChar"/>
           <w:lang w:val="en-US"/>
         </w:rPr>
-        <w:t>Main()</w:t>
+        <w:t>Main(</w:t>
+      </w:r>
+      <w:proofErr w:type="gramEnd"/>
+      <w:r>
+        <w:rPr>
+          <w:rStyle w:val="CodeChar"/>
+          <w:lang w:val="en-US"/>
+        </w:rPr>
+        <w:t>)</w:t>
       </w:r>
       <w:r>
         <w:rPr>
@@ -1470,11 +1659,33 @@
           <w:lang w:val="en-US"/>
         </w:rPr>
       </w:pPr>
-      <w:r>
-        <w:rPr>
-          <w:lang w:val="en-US"/>
-        </w:rPr>
-        <w:t>Note, that you have to change the range of the generated samples to get any samples with a value</w:t>
+      <w:proofErr w:type="gramStart"/>
+      <w:r>
+        <w:rPr>
+          <w:lang w:val="en-US"/>
+        </w:rPr>
+        <w:t>Note,</w:t>
+      </w:r>
+      <w:proofErr w:type="gramEnd"/>
+      <w:r>
+        <w:rPr>
+          <w:lang w:val="en-US"/>
+        </w:rPr>
+        <w:t xml:space="preserve"> that you </w:t>
+      </w:r>
+      <w:proofErr w:type="gramStart"/>
+      <w:r>
+        <w:rPr>
+          <w:lang w:val="en-US"/>
+        </w:rPr>
+        <w:t>have to</w:t>
+      </w:r>
+      <w:proofErr w:type="gramEnd"/>
+      <w:r>
+        <w:rPr>
+          <w:lang w:val="en-US"/>
+        </w:rPr>
+        <w:t xml:space="preserve"> change the range of the generated samples to get any samples with a value</w:t>
       </w:r>
       <w:r>
         <w:rPr>
@@ -1509,10 +1720,10 @@
           <w:noProof/>
         </w:rPr>
         <w:object w:dxaOrig="6586" w:dyaOrig="2805" w14:anchorId="78B0786C">
-          <v:shape id="_x0000_i1025" type="#_x0000_t75" alt="" style="width:304.05pt;height:129.05pt;mso-width-percent:0;mso-height-percent:0;mso-width-percent:0;mso-height-percent:0" o:ole="">
+          <v:shape id="_x0000_i1027" type="#_x0000_t75" alt="" style="width:303.95pt;height:129pt;mso-width-percent:0;mso-height-percent:0;mso-width-percent:0;mso-height-percent:0" o:ole="">
             <v:imagedata r:id="rId12" o:title=""/>
           </v:shape>
-          <o:OLEObject Type="Embed" ProgID="Visio.Drawing.15" ShapeID="_x0000_i1025" DrawAspect="Content" ObjectID="_1844920352" r:id="rId13"/>
+          <o:OLEObject Type="Embed" ProgID="Visio.Drawing.15" ShapeID="_x0000_i1027" DrawAspect="Content" ObjectID="_1849326781" r:id="rId13"/>
         </w:object>
       </w:r>
     </w:p>
@@ -1529,7 +1740,7 @@
 </file>
 
 <file path=word/endnotes.xml><?xml version="1.0" encoding="utf-8"?>
-<w:endnotes xmlns:wpc="http://schemas.microsoft.com/office/word/2010/wordprocessingCanvas" xmlns:cx="http://schemas.microsoft.com/office/drawing/2014/chartex" xmlns:cx1="http://schemas.microsoft.com/office/drawing/2015/9/8/chartex" xmlns:cx2="http://schemas.microsoft.com/office/drawing/2015/10/21/chartex" xmlns:cx3="http://schemas.microsoft.com/office/drawing/2016/5/9/chartex" xmlns:cx4="http://schemas.microsoft.com/office/drawing/2016/5/10/chartex" xmlns:cx5="http://schemas.microsoft.com/office/drawing/2016/5/11/chartex" xmlns:cx6="http://schemas.microsoft.com/office/drawing/2016/5/12/chartex" xmlns:cx7="http://schemas.microsoft.com/office/drawing/2016/5/13/chartex" xmlns:cx8="http://schemas.microsoft.com/office/drawing/2016/5/14/chartex" xmlns:mc="http://schemas.openxmlformats.org/markup-compatibility/2006" xmlns:m="http://schemas.openxmlformats.org/officeDocument/2006/math" xmlns:aink="http://schemas.microsoft.com/office/drawing/2016/ink" xmlns:am3d="http://schemas.microsoft.com/office/drawing/2017/model3d" xmlns:oel="http://schemas.microsoft.com/office/2019/extlst" xmlns:r="http://schemas.openxmlformats.org/officeDocument/2006/relationships" xmlns:wp14="http://schemas.microsoft.com/office/word/2010/wordprocessingDrawing" xmlns:wp="http://schemas.openxmlformats.org/drawingml/2006/wordprocessingDrawing" xmlns:wpg="http://schemas.microsoft.com/office/word/2010/wordprocessingGroup" xmlns:wpi="http://schemas.microsoft.com/office/word/2010/wordprocessingInk" xmlns:wps="http://schemas.microsoft.com/office/word/2010/wordprocessingShape" xmlns:o="urn:schemas-microsoft-com:office:office" xmlns:v="urn:schemas-microsoft-com:vml" xmlns:w10="urn:schemas-microsoft-com:office:word" xmlns:w="http://schemas.openxmlformats.org/wordprocessingml/2006/main" xmlns:w14="http://schemas.microsoft.com/office/word/2010/wordml" xmlns:w15="http://schemas.microsoft.com/office/word/2012/wordml" xmlns:w16cex="http://schemas.microsoft.com/office/word/2018/wordml/cex" xmlns:w16cid="http://schemas.microsoft.com/office/word/2016/wordml/cid" xmlns:w16="http://schemas.microsoft.com/office/word/2018/wordml" xmlns:w16sdtdh="http://schemas.microsoft.com/office/word/2020/wordml/sdtdatahash" xmlns:w16sdtfl="http://schemas.microsoft.com/office/word/2024/wordml/sdtformatlock" xmlns:w16se="http://schemas.microsoft.com/office/word/2015/wordml/symex" xmlns:w16du="http://schemas.microsoft.com/office/word/2023/wordml/word16du" xmlns:wne="http://schemas.microsoft.com/office/word/2006/wordml" mc:Ignorable="w14 w15 w16se w16cid w16 w16cex w16sdtdh w16sdtfl w16du wp14">
+<w:endnotes xmlns:wpc="http://schemas.microsoft.com/office/word/2010/wordprocessingCanvas" xmlns:cx="http://schemas.microsoft.com/office/drawing/2014/chartex" xmlns:cx1="http://schemas.microsoft.com/office/drawing/2015/9/8/chartex" xmlns:cx2="http://schemas.microsoft.com/office/drawing/2015/10/21/chartex" xmlns:cx3="http://schemas.microsoft.com/office/drawing/2016/5/9/chartex" xmlns:cx4="http://schemas.microsoft.com/office/drawing/2016/5/10/chartex" xmlns:cx5="http://schemas.microsoft.com/office/drawing/2016/5/11/chartex" xmlns:cx6="http://schemas.microsoft.com/office/drawing/2016/5/12/chartex" xmlns:cx7="http://schemas.microsoft.com/office/drawing/2016/5/13/chartex" xmlns:cx8="http://schemas.microsoft.com/office/drawing/2016/5/14/chartex" xmlns:mc="http://schemas.openxmlformats.org/markup-compatibility/2006" xmlns:aink="http://schemas.microsoft.com/office/drawing/2016/ink" xmlns:am3d="http://schemas.microsoft.com/office/drawing/2017/model3d" xmlns:o="urn:schemas-microsoft-com:office:office" xmlns:oel="http://schemas.microsoft.com/office/2019/extlst" xmlns:r="http://schemas.openxmlformats.org/officeDocument/2006/relationships" xmlns:m="http://schemas.openxmlformats.org/officeDocument/2006/math" xmlns:v="urn:schemas-microsoft-com:vml" xmlns:wp14="http://schemas.microsoft.com/office/word/2010/wordprocessingDrawing" xmlns:wp="http://schemas.openxmlformats.org/drawingml/2006/wordprocessingDrawing" xmlns:w10="urn:schemas-microsoft-com:office:word" xmlns:w="http://schemas.openxmlformats.org/wordprocessingml/2006/main" xmlns:w14="http://schemas.microsoft.com/office/word/2010/wordml" xmlns:w15="http://schemas.microsoft.com/office/word/2012/wordml" xmlns:w16cex="http://schemas.microsoft.com/office/word/2018/wordml/cex" xmlns:w16cid="http://schemas.microsoft.com/office/word/2016/wordml/cid" xmlns:w16="http://schemas.microsoft.com/office/word/2018/wordml" xmlns:w16du="http://schemas.microsoft.com/office/word/2023/wordml/word16du" xmlns:w16sdtdh="http://schemas.microsoft.com/office/word/2020/wordml/sdtdatahash" xmlns:w16sdtfl="http://schemas.microsoft.com/office/word/2024/wordml/sdtformatlock" xmlns:w16se="http://schemas.microsoft.com/office/word/2015/wordml/symex" xmlns:wpg="http://schemas.microsoft.com/office/word/2010/wordprocessingGroup" xmlns:wpi="http://schemas.microsoft.com/office/word/2010/wordprocessingInk" xmlns:wne="http://schemas.microsoft.com/office/word/2006/wordml" xmlns:wps="http://schemas.microsoft.com/office/word/2010/wordprocessingShape" mc:Ignorable="w14 w15 w16se w16cid w16 w16cex w16sdtdh w16sdtfl w16du wp14">
   <w:endnote w:type="separator" w:id="-1">
     <w:p>
       <w:r>
@@ -1548,7 +1759,7 @@
 </file>
 
 <file path=word/footer1.xml><?xml version="1.0" encoding="utf-8"?>
-<w:ftr xmlns:wpc="http://schemas.microsoft.com/office/word/2010/wordprocessingCanvas" xmlns:cx="http://schemas.microsoft.com/office/drawing/2014/chartex" xmlns:cx1="http://schemas.microsoft.com/office/drawing/2015/9/8/chartex" xmlns:cx2="http://schemas.microsoft.com/office/drawing/2015/10/21/chartex" xmlns:cx3="http://schemas.microsoft.com/office/drawing/2016/5/9/chartex" xmlns:cx4="http://schemas.microsoft.com/office/drawing/2016/5/10/chartex" xmlns:cx5="http://schemas.microsoft.com/office/drawing/2016/5/11/chartex" xmlns:cx6="http://schemas.microsoft.com/office/drawing/2016/5/12/chartex" xmlns:cx7="http://schemas.microsoft.com/office/drawing/2016/5/13/chartex" xmlns:cx8="http://schemas.microsoft.com/office/drawing/2016/5/14/chartex" xmlns:mc="http://schemas.openxmlformats.org/markup-compatibility/2006" xmlns:m="http://schemas.openxmlformats.org/officeDocument/2006/math" xmlns:aink="http://schemas.microsoft.com/office/drawing/2016/ink" xmlns:am3d="http://schemas.microsoft.com/office/drawing/2017/model3d" xmlns:oel="http://schemas.microsoft.com/office/2019/extlst" xmlns:r="http://schemas.openxmlformats.org/officeDocument/2006/relationships" xmlns:wp14="http://schemas.microsoft.com/office/word/2010/wordprocessingDrawing" xmlns:wp="http://schemas.openxmlformats.org/drawingml/2006/wordprocessingDrawing" xmlns:wpg="http://schemas.microsoft.com/office/word/2010/wordprocessingGroup" xmlns:wpi="http://schemas.microsoft.com/office/word/2010/wordprocessingInk" xmlns:wps="http://schemas.microsoft.com/office/word/2010/wordprocessingShape" xmlns:o="urn:schemas-microsoft-com:office:office" xmlns:v="urn:schemas-microsoft-com:vml" xmlns:w10="urn:schemas-microsoft-com:office:word" xmlns:w="http://schemas.openxmlformats.org/wordprocessingml/2006/main" xmlns:w14="http://schemas.microsoft.com/office/word/2010/wordml" xmlns:w15="http://schemas.microsoft.com/office/word/2012/wordml" xmlns:w16cex="http://schemas.microsoft.com/office/word/2018/wordml/cex" xmlns:w16cid="http://schemas.microsoft.com/office/word/2016/wordml/cid" xmlns:w16="http://schemas.microsoft.com/office/word/2018/wordml" xmlns:w16sdtdh="http://schemas.microsoft.com/office/word/2020/wordml/sdtdatahash" xmlns:w16sdtfl="http://schemas.microsoft.com/office/word/2024/wordml/sdtformatlock" xmlns:w16se="http://schemas.microsoft.com/office/word/2015/wordml/symex" xmlns:w16du="http://schemas.microsoft.com/office/word/2023/wordml/word16du" xmlns:wne="http://schemas.microsoft.com/office/word/2006/wordml" mc:Ignorable="w14 w15 w16se w16cid w16 w16cex w16sdtdh w16sdtfl w16du wp14">
+<w:ftr xmlns:wpc="http://schemas.microsoft.com/office/word/2010/wordprocessingCanvas" xmlns:cx="http://schemas.microsoft.com/office/drawing/2014/chartex" xmlns:cx1="http://schemas.microsoft.com/office/drawing/2015/9/8/chartex" xmlns:cx2="http://schemas.microsoft.com/office/drawing/2015/10/21/chartex" xmlns:cx3="http://schemas.microsoft.com/office/drawing/2016/5/9/chartex" xmlns:cx4="http://schemas.microsoft.com/office/drawing/2016/5/10/chartex" xmlns:cx5="http://schemas.microsoft.com/office/drawing/2016/5/11/chartex" xmlns:cx6="http://schemas.microsoft.com/office/drawing/2016/5/12/chartex" xmlns:cx7="http://schemas.microsoft.com/office/drawing/2016/5/13/chartex" xmlns:cx8="http://schemas.microsoft.com/office/drawing/2016/5/14/chartex" xmlns:mc="http://schemas.openxmlformats.org/markup-compatibility/2006" xmlns:aink="http://schemas.microsoft.com/office/drawing/2016/ink" xmlns:am3d="http://schemas.microsoft.com/office/drawing/2017/model3d" xmlns:o="urn:schemas-microsoft-com:office:office" xmlns:oel="http://schemas.microsoft.com/office/2019/extlst" xmlns:r="http://schemas.openxmlformats.org/officeDocument/2006/relationships" xmlns:m="http://schemas.openxmlformats.org/officeDocument/2006/math" xmlns:v="urn:schemas-microsoft-com:vml" xmlns:wp14="http://schemas.microsoft.com/office/word/2010/wordprocessingDrawing" xmlns:wp="http://schemas.openxmlformats.org/drawingml/2006/wordprocessingDrawing" xmlns:w10="urn:schemas-microsoft-com:office:word" xmlns:w="http://schemas.openxmlformats.org/wordprocessingml/2006/main" xmlns:w14="http://schemas.microsoft.com/office/word/2010/wordml" xmlns:w15="http://schemas.microsoft.com/office/word/2012/wordml" xmlns:w16cex="http://schemas.microsoft.com/office/word/2018/wordml/cex" xmlns:w16cid="http://schemas.microsoft.com/office/word/2016/wordml/cid" xmlns:w16="http://schemas.microsoft.com/office/word/2018/wordml" xmlns:w16du="http://schemas.microsoft.com/office/word/2023/wordml/word16du" xmlns:w16sdtdh="http://schemas.microsoft.com/office/word/2020/wordml/sdtdatahash" xmlns:w16sdtfl="http://schemas.microsoft.com/office/word/2024/wordml/sdtformatlock" xmlns:w16se="http://schemas.microsoft.com/office/word/2015/wordml/symex" xmlns:wpg="http://schemas.microsoft.com/office/word/2010/wordprocessingGroup" xmlns:wpi="http://schemas.microsoft.com/office/word/2010/wordprocessingInk" xmlns:wne="http://schemas.microsoft.com/office/word/2006/wordml" xmlns:wps="http://schemas.microsoft.com/office/word/2010/wordprocessingShape" mc:Ignorable="w14 w15 w16se w16cid w16 w16cex w16sdtdh w16sdtfl w16du wp14">
   <w:sdt>
     <w:sdtPr>
       <w:rPr>
@@ -1712,7 +1923,7 @@
 </file>
 
 <file path=word/footnotes.xml><?xml version="1.0" encoding="utf-8"?>
-<w:footnotes xmlns:wpc="http://schemas.microsoft.com/office/word/2010/wordprocessingCanvas" xmlns:cx="http://schemas.microsoft.com/office/drawing/2014/chartex" xmlns:cx1="http://schemas.microsoft.com/office/drawing/2015/9/8/chartex" xmlns:cx2="http://schemas.microsoft.com/office/drawing/2015/10/21/chartex" xmlns:cx3="http://schemas.microsoft.com/office/drawing/2016/5/9/chartex" xmlns:cx4="http://schemas.microsoft.com/office/drawing/2016/5/10/chartex" xmlns:cx5="http://schemas.microsoft.com/office/drawing/2016/5/11/chartex" xmlns:cx6="http://schemas.microsoft.com/office/drawing/2016/5/12/chartex" xmlns:cx7="http://schemas.microsoft.com/office/drawing/2016/5/13/chartex" xmlns:cx8="http://schemas.microsoft.com/office/drawing/2016/5/14/chartex" xmlns:mc="http://schemas.openxmlformats.org/markup-compatibility/2006" xmlns:m="http://schemas.openxmlformats.org/officeDocument/2006/math" xmlns:aink="http://schemas.microsoft.com/office/drawing/2016/ink" xmlns:am3d="http://schemas.microsoft.com/office/drawing/2017/model3d" xmlns:oel="http://schemas.microsoft.com/office/2019/extlst" xmlns:r="http://schemas.openxmlformats.org/officeDocument/2006/relationships" xmlns:wp14="http://schemas.microsoft.com/office/word/2010/wordprocessingDrawing" xmlns:wp="http://schemas.openxmlformats.org/drawingml/2006/wordprocessingDrawing" xmlns:wpg="http://schemas.microsoft.com/office/word/2010/wordprocessingGroup" xmlns:wpi="http://schemas.microsoft.com/office/word/2010/wordprocessingInk" xmlns:wps="http://schemas.microsoft.com/office/word/2010/wordprocessingShape" xmlns:o="urn:schemas-microsoft-com:office:office" xmlns:v="urn:schemas-microsoft-com:vml" xmlns:w10="urn:schemas-microsoft-com:office:word" xmlns:w="http://schemas.openxmlformats.org/wordprocessingml/2006/main" xmlns:w14="http://schemas.microsoft.com/office/word/2010/wordml" xmlns:w15="http://schemas.microsoft.com/office/word/2012/wordml" xmlns:w16cex="http://schemas.microsoft.com/office/word/2018/wordml/cex" xmlns:w16cid="http://schemas.microsoft.com/office/word/2016/wordml/cid" xmlns:w16="http://schemas.microsoft.com/office/word/2018/wordml" xmlns:w16sdtdh="http://schemas.microsoft.com/office/word/2020/wordml/sdtdatahash" xmlns:w16sdtfl="http://schemas.microsoft.com/office/word/2024/wordml/sdtformatlock" xmlns:w16se="http://schemas.microsoft.com/office/word/2015/wordml/symex" xmlns:w16du="http://schemas.microsoft.com/office/word/2023/wordml/word16du" xmlns:wne="http://schemas.microsoft.com/office/word/2006/wordml" mc:Ignorable="w14 w15 w16se w16cid w16 w16cex w16sdtdh w16sdtfl w16du wp14">
+<w:footnotes xmlns:wpc="http://schemas.microsoft.com/office/word/2010/wordprocessingCanvas" xmlns:cx="http://schemas.microsoft.com/office/drawing/2014/chartex" xmlns:cx1="http://schemas.microsoft.com/office/drawing/2015/9/8/chartex" xmlns:cx2="http://schemas.microsoft.com/office/drawing/2015/10/21/chartex" xmlns:cx3="http://schemas.microsoft.com/office/drawing/2016/5/9/chartex" xmlns:cx4="http://schemas.microsoft.com/office/drawing/2016/5/10/chartex" xmlns:cx5="http://schemas.microsoft.com/office/drawing/2016/5/11/chartex" xmlns:cx6="http://schemas.microsoft.com/office/drawing/2016/5/12/chartex" xmlns:cx7="http://schemas.microsoft.com/office/drawing/2016/5/13/chartex" xmlns:cx8="http://schemas.microsoft.com/office/drawing/2016/5/14/chartex" xmlns:mc="http://schemas.openxmlformats.org/markup-compatibility/2006" xmlns:aink="http://schemas.microsoft.com/office/drawing/2016/ink" xmlns:am3d="http://schemas.microsoft.com/office/drawing/2017/model3d" xmlns:o="urn:schemas-microsoft-com:office:office" xmlns:oel="http://schemas.microsoft.com/office/2019/extlst" xmlns:r="http://schemas.openxmlformats.org/officeDocument/2006/relationships" xmlns:m="http://schemas.openxmlformats.org/officeDocument/2006/math" xmlns:v="urn:schemas-microsoft-com:vml" xmlns:wp14="http://schemas.microsoft.com/office/word/2010/wordprocessingDrawing" xmlns:wp="http://schemas.openxmlformats.org/drawingml/2006/wordprocessingDrawing" xmlns:w10="urn:schemas-microsoft-com:office:word" xmlns:w="http://schemas.openxmlformats.org/wordprocessingml/2006/main" xmlns:w14="http://schemas.microsoft.com/office/word/2010/wordml" xmlns:w15="http://schemas.microsoft.com/office/word/2012/wordml" xmlns:w16cex="http://schemas.microsoft.com/office/word/2018/wordml/cex" xmlns:w16cid="http://schemas.microsoft.com/office/word/2016/wordml/cid" xmlns:w16="http://schemas.microsoft.com/office/word/2018/wordml" xmlns:w16du="http://schemas.microsoft.com/office/word/2023/wordml/word16du" xmlns:w16sdtdh="http://schemas.microsoft.com/office/word/2020/wordml/sdtdatahash" xmlns:w16sdtfl="http://schemas.microsoft.com/office/word/2024/wordml/sdtformatlock" xmlns:w16se="http://schemas.microsoft.com/office/word/2015/wordml/symex" xmlns:wpg="http://schemas.microsoft.com/office/word/2010/wordprocessingGroup" xmlns:wpi="http://schemas.microsoft.com/office/word/2010/wordprocessingInk" xmlns:wne="http://schemas.microsoft.com/office/word/2006/wordml" xmlns:wps="http://schemas.microsoft.com/office/word/2010/wordprocessingShape" mc:Ignorable="w14 w15 w16se w16cid w16 w16cex w16sdtdh w16sdtfl w16du wp14">
   <w:footnote w:type="separator" w:id="-1">
     <w:p>
       <w:r>
@@ -1731,7 +1942,7 @@
 </file>
 
 <file path=word/header1.xml><?xml version="1.0" encoding="utf-8"?>
-<w:hdr xmlns:wpc="http://schemas.microsoft.com/office/word/2010/wordprocessingCanvas" xmlns:cx="http://schemas.microsoft.com/office/drawing/2014/chartex" xmlns:cx1="http://schemas.microsoft.com/office/drawing/2015/9/8/chartex" xmlns:cx2="http://schemas.microsoft.com/office/drawing/2015/10/21/chartex" xmlns:cx3="http://schemas.microsoft.com/office/drawing/2016/5/9/chartex" xmlns:cx4="http://schemas.microsoft.com/office/drawing/2016/5/10/chartex" xmlns:cx5="http://schemas.microsoft.com/office/drawing/2016/5/11/chartex" xmlns:cx6="http://schemas.microsoft.com/office/drawing/2016/5/12/chartex" xmlns:cx7="http://schemas.microsoft.com/office/drawing/2016/5/13/chartex" xmlns:cx8="http://schemas.microsoft.com/office/drawing/2016/5/14/chartex" xmlns:mc="http://schemas.openxmlformats.org/markup-compatibility/2006" xmlns:m="http://schemas.openxmlformats.org/officeDocument/2006/math" xmlns:aink="http://schemas.microsoft.com/office/drawing/2016/ink" xmlns:am3d="http://schemas.microsoft.com/office/drawing/2017/model3d" xmlns:oel="http://schemas.microsoft.com/office/2019/extlst" xmlns:r="http://schemas.openxmlformats.org/officeDocument/2006/relationships" xmlns:wp14="http://schemas.microsoft.com/office/word/2010/wordprocessingDrawing" xmlns:wp="http://schemas.openxmlformats.org/drawingml/2006/wordprocessingDrawing" xmlns:wpg="http://schemas.microsoft.com/office/word/2010/wordprocessingGroup" xmlns:wpi="http://schemas.microsoft.com/office/word/2010/wordprocessingInk" xmlns:wps="http://schemas.microsoft.com/office/word/2010/wordprocessingShape" xmlns:o="urn:schemas-microsoft-com:office:office" xmlns:v="urn:schemas-microsoft-com:vml" xmlns:w10="urn:schemas-microsoft-com:office:word" xmlns:w="http://schemas.openxmlformats.org/wordprocessingml/2006/main" xmlns:w14="http://schemas.microsoft.com/office/word/2010/wordml" xmlns:w15="http://schemas.microsoft.com/office/word/2012/wordml" xmlns:w16cex="http://schemas.microsoft.com/office/word/2018/wordml/cex" xmlns:w16cid="http://schemas.microsoft.com/office/word/2016/wordml/cid" xmlns:w16="http://schemas.microsoft.com/office/word/2018/wordml" xmlns:w16sdtdh="http://schemas.microsoft.com/office/word/2020/wordml/sdtdatahash" xmlns:w16sdtfl="http://schemas.microsoft.com/office/word/2024/wordml/sdtformatlock" xmlns:w16se="http://schemas.microsoft.com/office/word/2015/wordml/symex" xmlns:w16du="http://schemas.microsoft.com/office/word/2023/wordml/word16du" xmlns:wne="http://schemas.microsoft.com/office/word/2006/wordml" mc:Ignorable="w14 w15 w16se w16cid w16 w16cex w16sdtdh w16sdtfl w16du wp14">
+<w:hdr xmlns:wpc="http://schemas.microsoft.com/office/word/2010/wordprocessingCanvas" xmlns:cx="http://schemas.microsoft.com/office/drawing/2014/chartex" xmlns:cx1="http://schemas.microsoft.com/office/drawing/2015/9/8/chartex" xmlns:cx2="http://schemas.microsoft.com/office/drawing/2015/10/21/chartex" xmlns:cx3="http://schemas.microsoft.com/office/drawing/2016/5/9/chartex" xmlns:cx4="http://schemas.microsoft.com/office/drawing/2016/5/10/chartex" xmlns:cx5="http://schemas.microsoft.com/office/drawing/2016/5/11/chartex" xmlns:cx6="http://schemas.microsoft.com/office/drawing/2016/5/12/chartex" xmlns:cx7="http://schemas.microsoft.com/office/drawing/2016/5/13/chartex" xmlns:cx8="http://schemas.microsoft.com/office/drawing/2016/5/14/chartex" xmlns:mc="http://schemas.openxmlformats.org/markup-compatibility/2006" xmlns:aink="http://schemas.microsoft.com/office/drawing/2016/ink" xmlns:am3d="http://schemas.microsoft.com/office/drawing/2017/model3d" xmlns:o="urn:schemas-microsoft-com:office:office" xmlns:oel="http://schemas.microsoft.com/office/2019/extlst" xmlns:r="http://schemas.openxmlformats.org/officeDocument/2006/relationships" xmlns:m="http://schemas.openxmlformats.org/officeDocument/2006/math" xmlns:v="urn:schemas-microsoft-com:vml" xmlns:wp14="http://schemas.microsoft.com/office/word/2010/wordprocessingDrawing" xmlns:wp="http://schemas.openxmlformats.org/drawingml/2006/wordprocessingDrawing" xmlns:w10="urn:schemas-microsoft-com:office:word" xmlns:w="http://schemas.openxmlformats.org/wordprocessingml/2006/main" xmlns:w14="http://schemas.microsoft.com/office/word/2010/wordml" xmlns:w15="http://schemas.microsoft.com/office/word/2012/wordml" xmlns:w16cex="http://schemas.microsoft.com/office/word/2018/wordml/cex" xmlns:w16cid="http://schemas.microsoft.com/office/word/2016/wordml/cid" xmlns:w16="http://schemas.microsoft.com/office/word/2018/wordml" xmlns:w16du="http://schemas.microsoft.com/office/word/2023/wordml/word16du" xmlns:w16sdtdh="http://schemas.microsoft.com/office/word/2020/wordml/sdtdatahash" xmlns:w16sdtfl="http://schemas.microsoft.com/office/word/2024/wordml/sdtformatlock" xmlns:w16se="http://schemas.microsoft.com/office/word/2015/wordml/symex" xmlns:wpg="http://schemas.microsoft.com/office/word/2010/wordprocessingGroup" xmlns:wpi="http://schemas.microsoft.com/office/word/2010/wordprocessingInk" xmlns:wne="http://schemas.microsoft.com/office/word/2006/wordml" xmlns:wps="http://schemas.microsoft.com/office/word/2010/wordprocessingShape" mc:Ignorable="w14 w15 w16se w16cid w16 w16cex w16sdtdh w16sdtfl w16du wp14">
   <w:p>
     <w:pPr>
       <w:pStyle w:val="Header"/>
@@ -1947,7 +2158,7 @@
 </file>
 
 <file path=word/numbering.xml><?xml version="1.0" encoding="utf-8"?>
-<w:numbering xmlns:wpc="http://schemas.microsoft.com/office/word/2010/wordprocessingCanvas" xmlns:cx="http://schemas.microsoft.com/office/drawing/2014/chartex" xmlns:cx1="http://schemas.microsoft.com/office/drawing/2015/9/8/chartex" xmlns:cx2="http://schemas.microsoft.com/office/drawing/2015/10/21/chartex" xmlns:cx3="http://schemas.microsoft.com/office/drawing/2016/5/9/chartex" xmlns:cx4="http://schemas.microsoft.com/office/drawing/2016/5/10/chartex" xmlns:cx5="http://schemas.microsoft.com/office/drawing/2016/5/11/chartex" xmlns:cx6="http://schemas.microsoft.com/office/drawing/2016/5/12/chartex" xmlns:cx7="http://schemas.microsoft.com/office/drawing/2016/5/13/chartex" xmlns:cx8="http://schemas.microsoft.com/office/drawing/2016/5/14/chartex" xmlns:mc="http://schemas.openxmlformats.org/markup-compatibility/2006" xmlns:m="http://schemas.openxmlformats.org/officeDocument/2006/math" xmlns:aink="http://schemas.microsoft.com/office/drawing/2016/ink" xmlns:am3d="http://schemas.microsoft.com/office/drawing/2017/model3d" xmlns:oel="http://schemas.microsoft.com/office/2019/extlst" xmlns:r="http://schemas.openxmlformats.org/officeDocument/2006/relationships" xmlns:wp14="http://schemas.microsoft.com/office/word/2010/wordprocessingDrawing" xmlns:wp="http://schemas.openxmlformats.org/drawingml/2006/wordprocessingDrawing" xmlns:wpg="http://schemas.microsoft.com/office/word/2010/wordprocessingGroup" xmlns:wpi="http://schemas.microsoft.com/office/word/2010/wordprocessingInk" xmlns:wps="http://schemas.microsoft.com/office/word/2010/wordprocessingShape" xmlns:o="urn:schemas-microsoft-com:office:office" xmlns:v="urn:schemas-microsoft-com:vml" xmlns:w10="urn:schemas-microsoft-com:office:word" xmlns:w="http://schemas.openxmlformats.org/wordprocessingml/2006/main" xmlns:w14="http://schemas.microsoft.com/office/word/2010/wordml" xmlns:w15="http://schemas.microsoft.com/office/word/2012/wordml" xmlns:w16cex="http://schemas.microsoft.com/office/word/2018/wordml/cex" xmlns:w16cid="http://schemas.microsoft.com/office/word/2016/wordml/cid" xmlns:w16="http://schemas.microsoft.com/office/word/2018/wordml" xmlns:w16sdtdh="http://schemas.microsoft.com/office/word/2020/wordml/sdtdatahash" xmlns:w16sdtfl="http://schemas.microsoft.com/office/word/2024/wordml/sdtformatlock" xmlns:w16se="http://schemas.microsoft.com/office/word/2015/wordml/symex" xmlns:w16du="http://schemas.microsoft.com/office/word/2023/wordml/word16du" xmlns:wne="http://schemas.microsoft.com/office/word/2006/wordml" mc:Ignorable="w14 w15 w16se w16cid w16 w16cex w16sdtdh w16sdtfl w16du wp14">
+<w:numbering xmlns:wpc="http://schemas.microsoft.com/office/word/2010/wordprocessingCanvas" xmlns:cx="http://schemas.microsoft.com/office/drawing/2014/chartex" xmlns:cx1="http://schemas.microsoft.com/office/drawing/2015/9/8/chartex" xmlns:cx2="http://schemas.microsoft.com/office/drawing/2015/10/21/chartex" xmlns:cx3="http://schemas.microsoft.com/office/drawing/2016/5/9/chartex" xmlns:cx4="http://schemas.microsoft.com/office/drawing/2016/5/10/chartex" xmlns:cx5="http://schemas.microsoft.com/office/drawing/2016/5/11/chartex" xmlns:cx6="http://schemas.microsoft.com/office/drawing/2016/5/12/chartex" xmlns:cx7="http://schemas.microsoft.com/office/drawing/2016/5/13/chartex" xmlns:cx8="http://schemas.microsoft.com/office/drawing/2016/5/14/chartex" xmlns:mc="http://schemas.openxmlformats.org/markup-compatibility/2006" xmlns:aink="http://schemas.microsoft.com/office/drawing/2016/ink" xmlns:am3d="http://schemas.microsoft.com/office/drawing/2017/model3d" xmlns:o="urn:schemas-microsoft-com:office:office" xmlns:oel="http://schemas.microsoft.com/office/2019/extlst" xmlns:r="http://schemas.openxmlformats.org/officeDocument/2006/relationships" xmlns:m="http://schemas.openxmlformats.org/officeDocument/2006/math" xmlns:v="urn:schemas-microsoft-com:vml" xmlns:wp14="http://schemas.microsoft.com/office/word/2010/wordprocessingDrawing" xmlns:wp="http://schemas.openxmlformats.org/drawingml/2006/wordprocessingDrawing" xmlns:w10="urn:schemas-microsoft-com:office:word" xmlns:w="http://schemas.openxmlformats.org/wordprocessingml/2006/main" xmlns:w14="http://schemas.microsoft.com/office/word/2010/wordml" xmlns:w15="http://schemas.microsoft.com/office/word/2012/wordml" xmlns:w16cex="http://schemas.microsoft.com/office/word/2018/wordml/cex" xmlns:w16cid="http://schemas.microsoft.com/office/word/2016/wordml/cid" xmlns:w16="http://schemas.microsoft.com/office/word/2018/wordml" xmlns:w16du="http://schemas.microsoft.com/office/word/2023/wordml/word16du" xmlns:w16sdtdh="http://schemas.microsoft.com/office/word/2020/wordml/sdtdatahash" xmlns:w16sdtfl="http://schemas.microsoft.com/office/word/2024/wordml/sdtformatlock" xmlns:w16se="http://schemas.microsoft.com/office/word/2015/wordml/symex" xmlns:wpg="http://schemas.microsoft.com/office/word/2010/wordprocessingGroup" xmlns:wpi="http://schemas.microsoft.com/office/word/2010/wordprocessingInk" xmlns:wne="http://schemas.microsoft.com/office/word/2006/wordml" xmlns:wps="http://schemas.microsoft.com/office/word/2010/wordprocessingShape" mc:Ignorable="w14 w15 w16se w16cid w16 w16cex w16sdtdh w16sdtfl w16du wp14">
   <w:abstractNum w:abstractNumId="0" w15:restartNumberingAfterBreak="0">
     <w:nsid w:val="2DFB2120"/>
     <w:multiLevelType w:val="hybridMultilevel"/>
@@ -2309,7 +2520,7 @@
 </file>
 
 <file path=word/styles.xml><?xml version="1.0" encoding="utf-8"?>
-<w:styles xmlns:mc="http://schemas.openxmlformats.org/markup-compatibility/2006" xmlns:r="http://schemas.openxmlformats.org/officeDocument/2006/relationships" xmlns:w="http://schemas.openxmlformats.org/wordprocessingml/2006/main" xmlns:w14="http://schemas.microsoft.com/office/word/2010/wordml" xmlns:w15="http://schemas.microsoft.com/office/word/2012/wordml" xmlns:w16cex="http://schemas.microsoft.com/office/word/2018/wordml/cex" xmlns:w16cid="http://schemas.microsoft.com/office/word/2016/wordml/cid" xmlns:w16="http://schemas.microsoft.com/office/word/2018/wordml" xmlns:w16sdtdh="http://schemas.microsoft.com/office/word/2020/wordml/sdtdatahash" xmlns:w16sdtfl="http://schemas.microsoft.com/office/word/2024/wordml/sdtformatlock" xmlns:w16se="http://schemas.microsoft.com/office/word/2015/wordml/symex" xmlns:w16du="http://schemas.microsoft.com/office/word/2023/wordml/word16du" mc:Ignorable="w14 w15 w16se w16cid w16 w16cex w16sdtdh w16sdtfl w16du">
+<w:styles xmlns:mc="http://schemas.openxmlformats.org/markup-compatibility/2006" xmlns:r="http://schemas.openxmlformats.org/officeDocument/2006/relationships" xmlns:w="http://schemas.openxmlformats.org/wordprocessingml/2006/main" xmlns:w14="http://schemas.microsoft.com/office/word/2010/wordml" xmlns:w15="http://schemas.microsoft.com/office/word/2012/wordml" xmlns:w16cex="http://schemas.microsoft.com/office/word/2018/wordml/cex" xmlns:w16cid="http://schemas.microsoft.com/office/word/2016/wordml/cid" xmlns:w16="http://schemas.microsoft.com/office/word/2018/wordml" xmlns:w16du="http://schemas.microsoft.com/office/word/2023/wordml/word16du" xmlns:w16sdtdh="http://schemas.microsoft.com/office/word/2020/wordml/sdtdatahash" xmlns:w16sdtfl="http://schemas.microsoft.com/office/word/2024/wordml/sdtformatlock" xmlns:w16se="http://schemas.microsoft.com/office/word/2015/wordml/symex" mc:Ignorable="w14 w15 w16se w16cid w16 w16cex w16sdtdh w16sdtfl w16du">
   <w:docDefaults>
     <w:rPrDefault>
       <w:rPr>
@@ -3390,4 +3601,10 @@
   <a:objectDefaults/>
   <a:extraClrSchemeLst/>
 </a:theme>
+</file>
+
+<file path=docMetadata/LabelInfo.xml><?xml version="1.0" encoding="utf-8"?>
+<clbl:labelList xmlns:clbl="http://schemas.microsoft.com/office/2020/mipLabelMetadata">
+  <clbl:label id="{61fd1d36-fecb-47ca-b7d7-d0df0370a198}" enabled="0" method="" siteId="{61fd1d36-fecb-47ca-b7d7-d0df0370a198}" removed="1"/>
+</clbl:labelList>
 </file>
</xml_diff>